<commit_message>
Add new SVG figure for rod inertia, documentation for Word report and repository updates, and optional background materials for labs 4 to 7
- Created `rod-inertia-axes.svg` to illustrate inertia concepts for a uniform rod.
- Added `OPEN_WORD_REPORT.md` to guide users on editing Word report templates.
- Introduced `UPDATE_REPOSITORY.md` for instructions on updating the course repository.
- Developed `OPTIONAL_BACKGROUND.md` for labs 4, 5, 6, and 7 to provide additional theoretical context.
- Implemented `check_readmes.py` script to validate Markdown files for broken links and formatting issues.
</commit_message>
<xml_diff>
--- a/lab04_jacobian_singularities/Lab04_Report_Template.docx
+++ b/lab04_jacobian_singularities/Lab04_Report_Template.docx
@@ -566,7 +566,7 @@
         <w:pStyle w:val="Heading1"/>
       </w:pPr>
       <w:r>
-        <w:t>4. Engineering questions</w:t>
+        <w:t>4. Engineering question</w:t>
       </w:r>
     </w:p>
     <w:p>
@@ -574,14 +574,7 @@
         <w:spacing w:before="120" w:after="60"/>
       </w:pPr>
       <w:r>
-        <w:rPr>
-          <w:rFonts w:ascii="Arial" w:hAnsi="Arial"/>
-          <w:b/>
-          <w:i w:val="0"/>
-          <w:color w:val="000000"/>
-          <w:sz w:val="22"/>
-        </w:rPr>
-        <w:t>1. What physical tool direction corresponds to the smallest singular value?</w:t>
+        <w:t>As the minimum singular value decreases, what happens to the required joint-rate magnitude, and how does damping change the commanded motion? Refer to your measured results.</w:t>
       </w:r>
     </w:p>
     <w:p>
@@ -589,424 +582,7 @@
         <w:spacing w:before="100" w:after="60"/>
       </w:pPr>
       <w:r>
-        <w:rPr>
-          <w:rFonts w:ascii="Arial" w:hAnsi="Arial"/>
-          <w:b/>
-          <w:i w:val="0"/>
-          <w:color w:val="000000"/>
-          <w:sz w:val="22"/>
-        </w:rPr>
-        <w:t>Answer</w:t>
-      </w:r>
-    </w:p>
-    <w:tbl>
-      <w:tblPr>
-        <w:tblW w:type="dxa" w:w="9360"/>
-        <w:tblLayout w:type="fixed"/>
-        <w:tblLook w:firstColumn="1" w:firstRow="1" w:lastColumn="0" w:lastRow="0" w:noHBand="0" w:noVBand="1" w:val="04A0"/>
-        <w:tblInd w:w="0" w:type="dxa"/>
-        <w:tblBorders>
-          <w:top w:val="single" w:sz="4" w:color="DADCE0"/>
-          <w:left w:val="single" w:sz="4" w:color="DADCE0"/>
-          <w:bottom w:val="single" w:sz="4" w:color="DADCE0"/>
-          <w:right w:val="single" w:sz="4" w:color="DADCE0"/>
-          <w:insideH w:val="nil"/>
-          <w:insideV w:val="nil"/>
-        </w:tblBorders>
-      </w:tblPr>
-      <w:tblGrid>
-        <w:gridCol w:w="9360"/>
-      </w:tblGrid>
-      <w:tr>
-        <w:trPr>
-          <w:trHeight w:val="936" w:hRule="atLeast"/>
-        </w:trPr>
-        <w:tc>
-          <w:tcPr>
-            <w:tcW w:type="dxa" w:w="9360"/>
-            <w:tcMar>
-              <w:top w:w="100" w:type="dxa"/>
-              <w:bottom w:w="100" w:type="dxa"/>
-              <w:start w:w="120" w:type="dxa"/>
-              <w:end w:w="120" w:type="dxa"/>
-            </w:tcMar>
-            <w:vAlign w:val="top"/>
-          </w:tcPr>
-          <w:p>
-            <w:pPr>
-              <w:spacing w:after="0"/>
-              <w:jc w:val="left"/>
-            </w:pPr>
-            <w:r>
-              <w:rPr>
-                <w:rFonts w:ascii="Arial" w:hAnsi="Arial"/>
-                <w:b w:val="0"/>
-                <w:i/>
-                <w:color w:val="555555"/>
-                <w:sz w:val="20"/>
-              </w:rPr>
-              <w:t>Type your answer here.</w:t>
-            </w:r>
-          </w:p>
-        </w:tc>
-      </w:tr>
-    </w:tbl>
-    <w:p>
-      <w:pPr>
-        <w:spacing w:before="120" w:after="60"/>
-      </w:pPr>
-      <w:r>
-        <w:rPr>
-          <w:rFonts w:ascii="Arial" w:hAnsi="Arial"/>
-          <w:b/>
-          <w:i w:val="0"/>
-          <w:color w:val="000000"/>
-          <w:sz w:val="22"/>
-        </w:rPr>
-        <w:t>2. Why can a modest Cartesian request demand extreme joint rates?</w:t>
-      </w:r>
-    </w:p>
-    <w:p>
-      <w:pPr>
-        <w:spacing w:before="100" w:after="60"/>
-      </w:pPr>
-      <w:r>
-        <w:rPr>
-          <w:rFonts w:ascii="Arial" w:hAnsi="Arial"/>
-          <w:b/>
-          <w:i w:val="0"/>
-          <w:color w:val="000000"/>
-          <w:sz w:val="22"/>
-        </w:rPr>
-        <w:t>Answer</w:t>
-      </w:r>
-    </w:p>
-    <w:tbl>
-      <w:tblPr>
-        <w:tblW w:type="dxa" w:w="9360"/>
-        <w:tblLayout w:type="fixed"/>
-        <w:tblLook w:firstColumn="1" w:firstRow="1" w:lastColumn="0" w:lastRow="0" w:noHBand="0" w:noVBand="1" w:val="04A0"/>
-        <w:tblInd w:w="0" w:type="dxa"/>
-        <w:tblBorders>
-          <w:top w:val="single" w:sz="4" w:color="DADCE0"/>
-          <w:left w:val="single" w:sz="4" w:color="DADCE0"/>
-          <w:bottom w:val="single" w:sz="4" w:color="DADCE0"/>
-          <w:right w:val="single" w:sz="4" w:color="DADCE0"/>
-          <w:insideH w:val="nil"/>
-          <w:insideV w:val="nil"/>
-        </w:tblBorders>
-      </w:tblPr>
-      <w:tblGrid>
-        <w:gridCol w:w="9360"/>
-      </w:tblGrid>
-      <w:tr>
-        <w:trPr>
-          <w:trHeight w:val="936" w:hRule="atLeast"/>
-        </w:trPr>
-        <w:tc>
-          <w:tcPr>
-            <w:tcW w:type="dxa" w:w="9360"/>
-            <w:tcMar>
-              <w:top w:w="100" w:type="dxa"/>
-              <w:bottom w:w="100" w:type="dxa"/>
-              <w:start w:w="120" w:type="dxa"/>
-              <w:end w:w="120" w:type="dxa"/>
-            </w:tcMar>
-            <w:vAlign w:val="top"/>
-          </w:tcPr>
-          <w:p>
-            <w:pPr>
-              <w:spacing w:after="0"/>
-              <w:jc w:val="left"/>
-            </w:pPr>
-            <w:r>
-              <w:rPr>
-                <w:rFonts w:ascii="Arial" w:hAnsi="Arial"/>
-                <w:b w:val="0"/>
-                <w:i/>
-                <w:color w:val="555555"/>
-                <w:sz w:val="20"/>
-              </w:rPr>
-              <w:t>Type your answer here.</w:t>
-            </w:r>
-          </w:p>
-        </w:tc>
-      </w:tr>
-    </w:tbl>
-    <w:p>
-      <w:pPr>
-        <w:spacing w:before="120" w:after="60"/>
-      </w:pPr>
-      <w:r>
-        <w:rPr>
-          <w:rFonts w:ascii="Arial" w:hAnsi="Arial"/>
-          <w:b/>
-          <w:i w:val="0"/>
-          <w:color w:val="000000"/>
-          <w:sz w:val="22"/>
-        </w:rPr>
-        <w:t>3. Why is determinant alone inadequate for many Jacobians?</w:t>
-      </w:r>
-    </w:p>
-    <w:p>
-      <w:pPr>
-        <w:spacing w:before="100" w:after="60"/>
-      </w:pPr>
-      <w:r>
-        <w:rPr>
-          <w:rFonts w:ascii="Arial" w:hAnsi="Arial"/>
-          <w:b/>
-          <w:i w:val="0"/>
-          <w:color w:val="000000"/>
-          <w:sz w:val="22"/>
-        </w:rPr>
-        <w:t>Answer</w:t>
-      </w:r>
-    </w:p>
-    <w:tbl>
-      <w:tblPr>
-        <w:tblW w:type="dxa" w:w="9360"/>
-        <w:tblLayout w:type="fixed"/>
-        <w:tblLook w:firstColumn="1" w:firstRow="1" w:lastColumn="0" w:lastRow="0" w:noHBand="0" w:noVBand="1" w:val="04A0"/>
-        <w:tblInd w:w="0" w:type="dxa"/>
-        <w:tblBorders>
-          <w:top w:val="single" w:sz="4" w:color="DADCE0"/>
-          <w:left w:val="single" w:sz="4" w:color="DADCE0"/>
-          <w:bottom w:val="single" w:sz="4" w:color="DADCE0"/>
-          <w:right w:val="single" w:sz="4" w:color="DADCE0"/>
-          <w:insideH w:val="nil"/>
-          <w:insideV w:val="nil"/>
-        </w:tblBorders>
-      </w:tblPr>
-      <w:tblGrid>
-        <w:gridCol w:w="9360"/>
-      </w:tblGrid>
-      <w:tr>
-        <w:trPr>
-          <w:trHeight w:val="936" w:hRule="atLeast"/>
-        </w:trPr>
-        <w:tc>
-          <w:tcPr>
-            <w:tcW w:type="dxa" w:w="9360"/>
-            <w:tcMar>
-              <w:top w:w="100" w:type="dxa"/>
-              <w:bottom w:w="100" w:type="dxa"/>
-              <w:start w:w="120" w:type="dxa"/>
-              <w:end w:w="120" w:type="dxa"/>
-            </w:tcMar>
-            <w:vAlign w:val="top"/>
-          </w:tcPr>
-          <w:p>
-            <w:pPr>
-              <w:spacing w:after="0"/>
-              <w:jc w:val="left"/>
-            </w:pPr>
-            <w:r>
-              <w:rPr>
-                <w:rFonts w:ascii="Arial" w:hAnsi="Arial"/>
-                <w:b w:val="0"/>
-                <w:i/>
-                <w:color w:val="555555"/>
-                <w:sz w:val="20"/>
-              </w:rPr>
-              <w:t>Type your answer here.</w:t>
-            </w:r>
-          </w:p>
-        </w:tc>
-      </w:tr>
-    </w:tbl>
-    <w:p>
-      <w:pPr>
-        <w:spacing w:before="120" w:after="60"/>
-      </w:pPr>
-      <w:r>
-        <w:rPr>
-          <w:rFonts w:ascii="Arial" w:hAnsi="Arial"/>
-          <w:b/>
-          <w:i w:val="0"/>
-          <w:color w:val="000000"/>
-          <w:sz w:val="22"/>
-        </w:rPr>
-        <w:t>4. How does damping trade Cartesian accuracy for numerical safety?</w:t>
-      </w:r>
-    </w:p>
-    <w:p>
-      <w:pPr>
-        <w:spacing w:before="100" w:after="60"/>
-      </w:pPr>
-      <w:r>
-        <w:rPr>
-          <w:rFonts w:ascii="Arial" w:hAnsi="Arial"/>
-          <w:b/>
-          <w:i w:val="0"/>
-          <w:color w:val="000000"/>
-          <w:sz w:val="22"/>
-        </w:rPr>
-        <w:t>Answer</w:t>
-      </w:r>
-    </w:p>
-    <w:tbl>
-      <w:tblPr>
-        <w:tblW w:type="dxa" w:w="9360"/>
-        <w:tblLayout w:type="fixed"/>
-        <w:tblLook w:firstColumn="1" w:firstRow="1" w:lastColumn="0" w:lastRow="0" w:noHBand="0" w:noVBand="1" w:val="04A0"/>
-        <w:tblInd w:w="0" w:type="dxa"/>
-        <w:tblBorders>
-          <w:top w:val="single" w:sz="4" w:color="DADCE0"/>
-          <w:left w:val="single" w:sz="4" w:color="DADCE0"/>
-          <w:bottom w:val="single" w:sz="4" w:color="DADCE0"/>
-          <w:right w:val="single" w:sz="4" w:color="DADCE0"/>
-          <w:insideH w:val="nil"/>
-          <w:insideV w:val="nil"/>
-        </w:tblBorders>
-      </w:tblPr>
-      <w:tblGrid>
-        <w:gridCol w:w="9360"/>
-      </w:tblGrid>
-      <w:tr>
-        <w:trPr>
-          <w:trHeight w:val="936" w:hRule="atLeast"/>
-        </w:trPr>
-        <w:tc>
-          <w:tcPr>
-            <w:tcW w:type="dxa" w:w="9360"/>
-            <w:tcMar>
-              <w:top w:w="100" w:type="dxa"/>
-              <w:bottom w:w="100" w:type="dxa"/>
-              <w:start w:w="120" w:type="dxa"/>
-              <w:end w:w="120" w:type="dxa"/>
-            </w:tcMar>
-            <w:vAlign w:val="top"/>
-          </w:tcPr>
-          <w:p>
-            <w:pPr>
-              <w:spacing w:after="0"/>
-              <w:jc w:val="left"/>
-            </w:pPr>
-            <w:r>
-              <w:rPr>
-                <w:rFonts w:ascii="Arial" w:hAnsi="Arial"/>
-                <w:b w:val="0"/>
-                <w:i/>
-                <w:color w:val="555555"/>
-                <w:sz w:val="20"/>
-              </w:rPr>
-              <w:t>Type your answer here.</w:t>
-            </w:r>
-          </w:p>
-        </w:tc>
-      </w:tr>
-    </w:tbl>
-    <w:p>
-      <w:pPr>
-        <w:spacing w:before="120" w:after="60"/>
-      </w:pPr>
-      <w:r>
-        <w:rPr>
-          <w:rFonts w:ascii="Arial" w:hAnsi="Arial"/>
-          <w:b/>
-          <w:i w:val="0"/>
-          <w:color w:val="000000"/>
-          <w:sz w:val="22"/>
-        </w:rPr>
-        <w:t>5. How do you distinguish a frame/sign error from a real singularity?</w:t>
-      </w:r>
-    </w:p>
-    <w:p>
-      <w:pPr>
-        <w:spacing w:before="100" w:after="60"/>
-      </w:pPr>
-      <w:r>
-        <w:rPr>
-          <w:rFonts w:ascii="Arial" w:hAnsi="Arial"/>
-          <w:b/>
-          <w:i w:val="0"/>
-          <w:color w:val="000000"/>
-          <w:sz w:val="22"/>
-        </w:rPr>
-        <w:t>Answer</w:t>
-      </w:r>
-    </w:p>
-    <w:tbl>
-      <w:tblPr>
-        <w:tblW w:type="dxa" w:w="9360"/>
-        <w:tblLayout w:type="fixed"/>
-        <w:tblLook w:firstColumn="1" w:firstRow="1" w:lastColumn="0" w:lastRow="0" w:noHBand="0" w:noVBand="1" w:val="04A0"/>
-        <w:tblInd w:w="0" w:type="dxa"/>
-        <w:tblBorders>
-          <w:top w:val="single" w:sz="4" w:color="DADCE0"/>
-          <w:left w:val="single" w:sz="4" w:color="DADCE0"/>
-          <w:bottom w:val="single" w:sz="4" w:color="DADCE0"/>
-          <w:right w:val="single" w:sz="4" w:color="DADCE0"/>
-          <w:insideH w:val="nil"/>
-          <w:insideV w:val="nil"/>
-        </w:tblBorders>
-      </w:tblPr>
-      <w:tblGrid>
-        <w:gridCol w:w="9360"/>
-      </w:tblGrid>
-      <w:tr>
-        <w:trPr>
-          <w:trHeight w:val="936" w:hRule="atLeast"/>
-        </w:trPr>
-        <w:tc>
-          <w:tcPr>
-            <w:tcW w:type="dxa" w:w="9360"/>
-            <w:tcMar>
-              <w:top w:w="100" w:type="dxa"/>
-              <w:bottom w:w="100" w:type="dxa"/>
-              <w:start w:w="120" w:type="dxa"/>
-              <w:end w:w="120" w:type="dxa"/>
-            </w:tcMar>
-            <w:vAlign w:val="top"/>
-          </w:tcPr>
-          <w:p>
-            <w:pPr>
-              <w:spacing w:after="0"/>
-              <w:jc w:val="left"/>
-            </w:pPr>
-            <w:r>
-              <w:rPr>
-                <w:rFonts w:ascii="Arial" w:hAnsi="Arial"/>
-                <w:b w:val="0"/>
-                <w:i/>
-                <w:color w:val="555555"/>
-                <w:sz w:val="20"/>
-              </w:rPr>
-              <w:t>Type your answer here.</w:t>
-            </w:r>
-          </w:p>
-        </w:tc>
-      </w:tr>
-    </w:tbl>
-    <w:p>
-      <w:pPr>
-        <w:spacing w:before="120" w:after="60"/>
-      </w:pPr>
-      <w:r>
-        <w:rPr>
-          <w:rFonts w:ascii="Arial" w:hAnsi="Arial"/>
-          <w:b/>
-          <w:i w:val="0"/>
-          <w:color w:val="000000"/>
-          <w:sz w:val="22"/>
-        </w:rPr>
-        <w:t>6. Which safeguards prevented unsafe motion?</w:t>
-      </w:r>
-    </w:p>
-    <w:p>
-      <w:pPr>
-        <w:spacing w:before="100" w:after="60"/>
-      </w:pPr>
-      <w:r>
-        <w:rPr>
-          <w:rFonts w:ascii="Arial" w:hAnsi="Arial"/>
-          <w:b/>
-          <w:i w:val="0"/>
-          <w:color w:val="000000"/>
-          <w:sz w:val="22"/>
-        </w:rPr>
-        <w:t>Answer</w:t>
+        <w:t>Answer in 2-3 sentences.</w:t>
       </w:r>
     </w:p>
     <w:tbl>

</xml_diff>

<commit_message>
Refactor Lab 4 documentation and code for clarity and completeness; update report template, README, and answers, and implement singularity demonstration controller
</commit_message>
<xml_diff>
--- a/lab04_jacobian_singularities/Lab04_Report_Template.docx
+++ b/lab04_jacobian_singularities/Lab04_Report_Template.docx
@@ -4,120 +4,40 @@
   <w:body>
     <w:p>
       <w:pPr>
-        <w:spacing w:after="60"/>
+        <w:pStyle w:val="Title"/>
+        <w:jc w:val="center"/>
       </w:pPr>
       <w:r>
-        <w:rPr>
-          <w:rFonts w:ascii="Arial" w:hAnsi="Arial"/>
-          <w:b w:val="0"/>
-          <w:i w:val="0"/>
-          <w:color w:val="000000"/>
-          <w:sz w:val="52"/>
-        </w:rPr>
-        <w:t>Lab 4 Report</w:t>
+        <w:t>Lab 4 Singularity Observation Report</w:t>
       </w:r>
     </w:p>
     <w:p>
       <w:pPr>
-        <w:spacing w:after="280"/>
+        <w:pStyle w:val="Subtitle"/>
+        <w:jc w:val="center"/>
       </w:pPr>
       <w:r>
-        <w:rPr>
-          <w:rFonts w:ascii="Arial" w:hAnsi="Arial"/>
-          <w:b w:val="0"/>
-          <w:i w:val="0"/>
-          <w:color w:val="555555"/>
-          <w:sz w:val="24"/>
-        </w:rPr>
-        <w:t>Jacobian, Differential Kinematics, and Singularities</w:t>
+        <w:t>EEL 4664 Robotics</w:t>
       </w:r>
     </w:p>
     <w:p>
-      <w:pPr>
-        <w:spacing w:after="100"/>
-      </w:pPr>
       <w:r>
-        <w:rPr>
-          <w:rFonts w:ascii="Arial" w:hAnsi="Arial"/>
-          <w:b/>
-          <w:i w:val="0"/>
-          <w:color w:val="000000"/>
-          <w:sz w:val="22"/>
-        </w:rPr>
-        <w:t xml:space="preserve">Name: </w:t>
-      </w:r>
-      <w:r>
-        <w:rPr>
-          <w:rFonts w:ascii="Arial" w:hAnsi="Arial"/>
-          <w:b w:val="0"/>
-          <w:i w:val="0"/>
-          <w:color w:val="000000"/>
-          <w:sz w:val="22"/>
-        </w:rPr>
-        <w:t>____________________________________________________________</w:t>
+        <w:t>Compare the same Cartesian request at a bent-elbow pose and near a straight-elbow singularity. The near-singular trials compare a safely rate-limited undamped inverse with a damped inverse.</w:t>
       </w:r>
     </w:p>
     <w:p>
-      <w:pPr>
-        <w:spacing w:after="100"/>
-      </w:pPr>
       <w:r>
-        <w:rPr>
-          <w:rFonts w:ascii="Arial" w:hAnsi="Arial"/>
-          <w:b/>
-          <w:i w:val="0"/>
-          <w:color w:val="000000"/>
-          <w:sz w:val="22"/>
-        </w:rPr>
-        <w:t xml:space="preserve">Section or team: </w:t>
-      </w:r>
-      <w:r>
-        <w:rPr>
-          <w:rFonts w:ascii="Arial" w:hAnsi="Arial"/>
-          <w:b w:val="0"/>
-          <w:i w:val="0"/>
-          <w:color w:val="000000"/>
-          <w:sz w:val="22"/>
-        </w:rPr>
-        <w:t>____________________________________________________________</w:t>
+        <w:t>Name: ______________________________________________</w:t>
       </w:r>
     </w:p>
     <w:p>
-      <w:pPr>
-        <w:spacing w:after="100"/>
-      </w:pPr>
       <w:r>
-        <w:rPr>
-          <w:rFonts w:ascii="Arial" w:hAnsi="Arial"/>
-          <w:b/>
-          <w:i w:val="0"/>
-          <w:color w:val="000000"/>
-          <w:sz w:val="22"/>
-        </w:rPr>
-        <w:t xml:space="preserve">Date: </w:t>
-      </w:r>
-      <w:r>
-        <w:rPr>
-          <w:rFonts w:ascii="Arial" w:hAnsi="Arial"/>
-          <w:b w:val="0"/>
-          <w:i w:val="0"/>
-          <w:color w:val="000000"/>
-          <w:sz w:val="22"/>
-        </w:rPr>
-        <w:t>____________________________________________________________</w:t>
+        <w:t>Section or team: _____________________________________</w:t>
       </w:r>
     </w:p>
     <w:p>
-      <w:pPr>
-        <w:spacing w:before="160" w:after="160"/>
-      </w:pPr>
       <w:r>
-        <w:rPr>
-          <w:rFonts w:ascii="Arial" w:hAnsi="Arial"/>
-          <w:b w:val="0"/>
-          <w:sz w:val="22"/>
-        </w:rPr>
-        <w:t>Directions: Open this template in Microsoft Word. Before entering results, select File &gt; Save As and create a personal copy named LastName_Lab04_Report.docx. Replace the prompt text with your results. Paste output as text and add the required plot with Insert &gt; Pictures. Complete and submit your personal .docx copy.</w:t>
+        <w:t>Date: _______________________________________________</w:t>
       </w:r>
     </w:p>
     <w:p>
@@ -125,138 +45,948 @@
         <w:pStyle w:val="Heading1"/>
       </w:pPr>
       <w:r>
-        <w:t>1. Jacobian validation</w:t>
+        <w:t>Prediction</w:t>
+      </w:r>
+    </w:p>
+    <w:p>
+      <w:r>
+        <w:t>Before running Webots, predict which trial will show the most joint motion and which trial will move the tool closest to the requested 6 cm.</w:t>
       </w:r>
     </w:p>
     <w:p>
       <w:pPr>
-        <w:spacing w:before="100" w:after="60"/>
+        <w:keepLines/>
+        <w:spacing w:after="100"/>
       </w:pPr>
       <w:r>
-        <w:rPr>
-          <w:rFonts w:ascii="Arial" w:hAnsi="Arial"/>
-          <w:b/>
-          <w:i w:val="0"/>
-          <w:color w:val="000000"/>
-          <w:sz w:val="22"/>
-        </w:rPr>
-        <w:t>Derivation and convention</w:t>
+        <w:t>________________________________________________________________________________</w:t>
+      </w:r>
+    </w:p>
+    <w:p>
+      <w:pPr>
+        <w:keepLines/>
+        <w:spacing w:after="100"/>
+      </w:pPr>
+      <w:r>
+        <w:t>________________________________________________________________________________</w:t>
+      </w:r>
+    </w:p>
+    <w:p>
+      <w:pPr>
+        <w:pStyle w:val="Heading1"/>
+      </w:pPr>
+      <w:r>
+        <w:t>Recorded Results</w:t>
+      </w:r>
+    </w:p>
+    <w:p>
+      <w:r>
+        <w:t>Copy the values printed by the singularity_demo controller.</w:t>
       </w:r>
     </w:p>
     <w:tbl>
       <w:tblPr>
-        <w:tblW w:type="dxa" w:w="9360"/>
+        <w:tblW w:type="auto" w:w="0"/>
+        <w:jc w:val="center"/>
         <w:tblLayout w:type="fixed"/>
         <w:tblLook w:firstColumn="1" w:firstRow="1" w:lastColumn="0" w:lastRow="0" w:noHBand="0" w:noVBand="1" w:val="04A0"/>
-        <w:tblInd w:w="0" w:type="dxa"/>
-        <w:tblBorders>
-          <w:top w:val="single" w:sz="4" w:color="DADCE0"/>
-          <w:left w:val="single" w:sz="4" w:color="DADCE0"/>
-          <w:bottom w:val="single" w:sz="4" w:color="DADCE0"/>
-          <w:right w:val="single" w:sz="4" w:color="DADCE0"/>
-          <w:insideH w:val="nil"/>
-          <w:insideV w:val="nil"/>
-        </w:tblBorders>
       </w:tblPr>
       <w:tblGrid>
-        <w:gridCol w:w="9360"/>
+        <w:gridCol w:w="2520"/>
+        <w:gridCol w:w="2520"/>
+        <w:gridCol w:w="2520"/>
+        <w:gridCol w:w="2520"/>
       </w:tblGrid>
       <w:tr>
-        <w:trPr>
-          <w:trHeight w:val="1728" w:hRule="atLeast"/>
-        </w:trPr>
         <w:tc>
           <w:tcPr>
-            <w:tcW w:type="dxa" w:w="9360"/>
+            <w:tcW w:type="dxa" w:w="3240"/>
+            <w:vAlign w:val="center"/>
             <w:tcMar>
               <w:top w:w="100" w:type="dxa"/>
+              <w:start w:w="100" w:type="dxa"/>
               <w:bottom w:w="100" w:type="dxa"/>
-              <w:start w:w="120" w:type="dxa"/>
-              <w:end w:w="120" w:type="dxa"/>
+              <w:end w:w="100" w:type="dxa"/>
             </w:tcMar>
-            <w:vAlign w:val="top"/>
+            <w:tcBorders>
+              <w:top w:val="single" w:sz="6" w:color="D9D9D9"/>
+              <w:left w:val="single" w:sz="6" w:color="D9D9D9"/>
+              <w:bottom w:val="single" w:sz="6" w:color="D9D9D9"/>
+              <w:right w:val="single" w:sz="6" w:color="D9D9D9"/>
+              <w:insideH w:val="single" w:sz="6" w:color="D9D9D9"/>
+              <w:insideV w:val="single" w:sz="6" w:color="D9D9D9"/>
+            </w:tcBorders>
+            <w:shd w:fill="1F4E78"/>
           </w:tcPr>
           <w:p>
             <w:pPr>
-              <w:spacing w:after="0"/>
-              <w:jc w:val="left"/>
+              <w:spacing w:after="40"/>
             </w:pPr>
             <w:r>
               <w:rPr>
-                <w:rFonts w:ascii="Arial" w:hAnsi="Arial"/>
-                <w:b w:val="0"/>
-                <w:i/>
-                <w:color w:val="555555"/>
-                <w:sz w:val="20"/>
+                <w:b/>
+                <w:color w:val="FFFFFF"/>
+                <w:sz w:val="18"/>
               </w:rPr>
-              <w:t>State the Jacobian frame/convention, where each modified-DH joint axis is recorded, and the two geometric column expressions.</w:t>
+              <w:t>Quantity</w:t>
+            </w:r>
+          </w:p>
+        </w:tc>
+        <w:tc>
+          <w:tcPr>
+            <w:tcW w:type="dxa" w:w="2232"/>
+            <w:vAlign w:val="center"/>
+            <w:tcMar>
+              <w:top w:w="100" w:type="dxa"/>
+              <w:start w:w="100" w:type="dxa"/>
+              <w:bottom w:w="100" w:type="dxa"/>
+              <w:end w:w="100" w:type="dxa"/>
+            </w:tcMar>
+            <w:tcBorders>
+              <w:top w:val="single" w:sz="6" w:color="D9D9D9"/>
+              <w:left w:val="single" w:sz="6" w:color="D9D9D9"/>
+              <w:bottom w:val="single" w:sz="6" w:color="D9D9D9"/>
+              <w:right w:val="single" w:sz="6" w:color="D9D9D9"/>
+              <w:insideH w:val="single" w:sz="6" w:color="D9D9D9"/>
+              <w:insideV w:val="single" w:sz="6" w:color="D9D9D9"/>
+            </w:tcBorders>
+            <w:shd w:fill="1F4E78"/>
+          </w:tcPr>
+          <w:p>
+            <w:pPr>
+              <w:spacing w:after="40"/>
+            </w:pPr>
+            <w:r>
+              <w:rPr>
+                <w:b/>
+                <w:color w:val="FFFFFF"/>
+                <w:sz w:val="18"/>
+              </w:rPr>
+              <w:t>Trial 1</w:t>
+              <w:br/>
+              <w:t>Bent undamped</w:t>
+            </w:r>
+          </w:p>
+        </w:tc>
+        <w:tc>
+          <w:tcPr>
+            <w:tcW w:type="dxa" w:w="2304"/>
+            <w:vAlign w:val="center"/>
+            <w:tcMar>
+              <w:top w:w="100" w:type="dxa"/>
+              <w:start w:w="100" w:type="dxa"/>
+              <w:bottom w:w="100" w:type="dxa"/>
+              <w:end w:w="100" w:type="dxa"/>
+            </w:tcMar>
+            <w:tcBorders>
+              <w:top w:val="single" w:sz="6" w:color="D9D9D9"/>
+              <w:left w:val="single" w:sz="6" w:color="D9D9D9"/>
+              <w:bottom w:val="single" w:sz="6" w:color="D9D9D9"/>
+              <w:right w:val="single" w:sz="6" w:color="D9D9D9"/>
+              <w:insideH w:val="single" w:sz="6" w:color="D9D9D9"/>
+              <w:insideV w:val="single" w:sz="6" w:color="D9D9D9"/>
+            </w:tcBorders>
+            <w:shd w:fill="1F4E78"/>
+          </w:tcPr>
+          <w:p>
+            <w:pPr>
+              <w:spacing w:after="40"/>
+            </w:pPr>
+            <w:r>
+              <w:rPr>
+                <w:b/>
+                <w:color w:val="FFFFFF"/>
+                <w:sz w:val="18"/>
+              </w:rPr>
+              <w:t>Trial 2</w:t>
+              <w:br/>
+              <w:t>Near undamped</w:t>
+            </w:r>
+          </w:p>
+        </w:tc>
+        <w:tc>
+          <w:tcPr>
+            <w:tcW w:type="dxa" w:w="2304"/>
+            <w:vAlign w:val="center"/>
+            <w:tcMar>
+              <w:top w:w="100" w:type="dxa"/>
+              <w:start w:w="100" w:type="dxa"/>
+              <w:bottom w:w="100" w:type="dxa"/>
+              <w:end w:w="100" w:type="dxa"/>
+            </w:tcMar>
+            <w:tcBorders>
+              <w:top w:val="single" w:sz="6" w:color="D9D9D9"/>
+              <w:left w:val="single" w:sz="6" w:color="D9D9D9"/>
+              <w:bottom w:val="single" w:sz="6" w:color="D9D9D9"/>
+              <w:right w:val="single" w:sz="6" w:color="D9D9D9"/>
+              <w:insideH w:val="single" w:sz="6" w:color="D9D9D9"/>
+              <w:insideV w:val="single" w:sz="6" w:color="D9D9D9"/>
+            </w:tcBorders>
+            <w:shd w:fill="1F4E78"/>
+          </w:tcPr>
+          <w:p>
+            <w:pPr>
+              <w:spacing w:after="40"/>
+            </w:pPr>
+            <w:r>
+              <w:rPr>
+                <w:b/>
+                <w:color w:val="FFFFFF"/>
+                <w:sz w:val="18"/>
+              </w:rPr>
+              <w:t>Trial 3</w:t>
+              <w:br/>
+              <w:t>Near damped</w:t>
             </w:r>
           </w:p>
         </w:tc>
       </w:tr>
-    </w:tbl>
-    <w:p>
-      <w:pPr>
-        <w:spacing w:before="100" w:after="60"/>
-      </w:pPr>
-      <w:r>
-        <w:rPr>
-          <w:rFonts w:ascii="Arial" w:hAnsi="Arial"/>
-          <w:b/>
-          <w:i w:val="0"/>
-          <w:color w:val="000000"/>
-          <w:sz w:val="22"/>
-        </w:rPr>
-        <w:t>Finite-difference validation</w:t>
-      </w:r>
-    </w:p>
-    <w:tbl>
-      <w:tblPr>
-        <w:tblW w:type="dxa" w:w="9360"/>
-        <w:tblLayout w:type="fixed"/>
-        <w:tblLook w:firstColumn="1" w:firstRow="1" w:lastColumn="0" w:lastRow="0" w:noHBand="0" w:noVBand="1" w:val="04A0"/>
-        <w:tblInd w:w="0" w:type="dxa"/>
-        <w:tblBorders>
-          <w:top w:val="single" w:sz="4" w:color="DADCE0"/>
-          <w:left w:val="single" w:sz="4" w:color="DADCE0"/>
-          <w:bottom w:val="single" w:sz="4" w:color="DADCE0"/>
-          <w:right w:val="single" w:sz="4" w:color="DADCE0"/>
-          <w:insideH w:val="nil"/>
-          <w:insideV w:val="nil"/>
-        </w:tblBorders>
-      </w:tblPr>
-      <w:tblGrid>
-        <w:gridCol w:w="9360"/>
-      </w:tblGrid>
       <w:tr>
-        <w:trPr>
-          <w:trHeight w:val="1872" w:hRule="atLeast"/>
-        </w:trPr>
         <w:tc>
           <w:tcPr>
-            <w:tcW w:type="dxa" w:w="9360"/>
+            <w:tcW w:type="dxa" w:w="3240"/>
+            <w:vAlign w:val="center"/>
             <w:tcMar>
               <w:top w:w="100" w:type="dxa"/>
+              <w:start w:w="100" w:type="dxa"/>
               <w:bottom w:w="100" w:type="dxa"/>
-              <w:start w:w="120" w:type="dxa"/>
-              <w:end w:w="120" w:type="dxa"/>
+              <w:end w:w="100" w:type="dxa"/>
             </w:tcMar>
-            <w:vAlign w:val="top"/>
+            <w:tcBorders>
+              <w:top w:val="single" w:sz="6" w:color="D9D9D9"/>
+              <w:left w:val="single" w:sz="6" w:color="D9D9D9"/>
+              <w:bottom w:val="single" w:sz="6" w:color="D9D9D9"/>
+              <w:right w:val="single" w:sz="6" w:color="D9D9D9"/>
+              <w:insideH w:val="single" w:sz="6" w:color="D9D9D9"/>
+              <w:insideV w:val="single" w:sz="6" w:color="D9D9D9"/>
+            </w:tcBorders>
           </w:tcPr>
           <w:p>
             <w:pPr>
-              <w:spacing w:after="0"/>
-              <w:jc w:val="left"/>
+              <w:spacing w:after="40"/>
             </w:pPr>
             <w:r>
               <w:rPr>
-                <w:rFonts w:ascii="Consolas" w:hAnsi="Consolas"/>
-                <w:b w:val="0"/>
-                <w:i/>
-                <w:color w:val="555555"/>
                 <w:sz w:val="19"/>
               </w:rPr>
-              <w:t>Paste the centered finite-difference study and summarize the agreement.</w:t>
+              <w:t>Minimum singular value</w:t>
+            </w:r>
+          </w:p>
+        </w:tc>
+        <w:tc>
+          <w:tcPr>
+            <w:tcW w:type="dxa" w:w="2232"/>
+            <w:vAlign w:val="center"/>
+            <w:tcMar>
+              <w:top w:w="100" w:type="dxa"/>
+              <w:start w:w="100" w:type="dxa"/>
+              <w:bottom w:w="100" w:type="dxa"/>
+              <w:end w:w="100" w:type="dxa"/>
+            </w:tcMar>
+            <w:tcBorders>
+              <w:top w:val="single" w:sz="6" w:color="D9D9D9"/>
+              <w:left w:val="single" w:sz="6" w:color="D9D9D9"/>
+              <w:bottom w:val="single" w:sz="6" w:color="D9D9D9"/>
+              <w:right w:val="single" w:sz="6" w:color="D9D9D9"/>
+              <w:insideH w:val="single" w:sz="6" w:color="D9D9D9"/>
+              <w:insideV w:val="single" w:sz="6" w:color="D9D9D9"/>
+            </w:tcBorders>
+          </w:tcPr>
+          <w:p>
+            <w:pPr>
+              <w:spacing w:after="40"/>
+            </w:pPr>
+            <w:r>
+              <w:rPr>
+                <w:sz w:val="19"/>
+              </w:rPr>
+            </w:r>
+          </w:p>
+        </w:tc>
+        <w:tc>
+          <w:tcPr>
+            <w:tcW w:type="dxa" w:w="2304"/>
+            <w:vAlign w:val="center"/>
+            <w:tcMar>
+              <w:top w:w="100" w:type="dxa"/>
+              <w:start w:w="100" w:type="dxa"/>
+              <w:bottom w:w="100" w:type="dxa"/>
+              <w:end w:w="100" w:type="dxa"/>
+            </w:tcMar>
+            <w:tcBorders>
+              <w:top w:val="single" w:sz="6" w:color="D9D9D9"/>
+              <w:left w:val="single" w:sz="6" w:color="D9D9D9"/>
+              <w:bottom w:val="single" w:sz="6" w:color="D9D9D9"/>
+              <w:right w:val="single" w:sz="6" w:color="D9D9D9"/>
+              <w:insideH w:val="single" w:sz="6" w:color="D9D9D9"/>
+              <w:insideV w:val="single" w:sz="6" w:color="D9D9D9"/>
+            </w:tcBorders>
+          </w:tcPr>
+          <w:p>
+            <w:pPr>
+              <w:spacing w:after="40"/>
+            </w:pPr>
+            <w:r>
+              <w:rPr>
+                <w:sz w:val="19"/>
+              </w:rPr>
+            </w:r>
+          </w:p>
+        </w:tc>
+        <w:tc>
+          <w:tcPr>
+            <w:tcW w:type="dxa" w:w="2304"/>
+            <w:vAlign w:val="center"/>
+            <w:tcMar>
+              <w:top w:w="100" w:type="dxa"/>
+              <w:start w:w="100" w:type="dxa"/>
+              <w:bottom w:w="100" w:type="dxa"/>
+              <w:end w:w="100" w:type="dxa"/>
+            </w:tcMar>
+            <w:tcBorders>
+              <w:top w:val="single" w:sz="6" w:color="D9D9D9"/>
+              <w:left w:val="single" w:sz="6" w:color="D9D9D9"/>
+              <w:bottom w:val="single" w:sz="6" w:color="D9D9D9"/>
+              <w:right w:val="single" w:sz="6" w:color="D9D9D9"/>
+              <w:insideH w:val="single" w:sz="6" w:color="D9D9D9"/>
+              <w:insideV w:val="single" w:sz="6" w:color="D9D9D9"/>
+            </w:tcBorders>
+          </w:tcPr>
+          <w:p>
+            <w:pPr>
+              <w:spacing w:after="40"/>
+            </w:pPr>
+            <w:r>
+              <w:rPr>
+                <w:sz w:val="19"/>
+              </w:rPr>
+            </w:r>
+          </w:p>
+        </w:tc>
+      </w:tr>
+      <w:tr>
+        <w:tc>
+          <w:tcPr>
+            <w:tcW w:type="dxa" w:w="3240"/>
+            <w:vAlign w:val="center"/>
+            <w:tcMar>
+              <w:top w:w="100" w:type="dxa"/>
+              <w:start w:w="100" w:type="dxa"/>
+              <w:bottom w:w="100" w:type="dxa"/>
+              <w:end w:w="100" w:type="dxa"/>
+            </w:tcMar>
+            <w:tcBorders>
+              <w:top w:val="single" w:sz="6" w:color="D9D9D9"/>
+              <w:left w:val="single" w:sz="6" w:color="D9D9D9"/>
+              <w:bottom w:val="single" w:sz="6" w:color="D9D9D9"/>
+              <w:right w:val="single" w:sz="6" w:color="D9D9D9"/>
+              <w:insideH w:val="single" w:sz="6" w:color="D9D9D9"/>
+              <w:insideV w:val="single" w:sz="6" w:color="D9D9D9"/>
+            </w:tcBorders>
+            <w:shd w:fill="EAF2F8"/>
+          </w:tcPr>
+          <w:p>
+            <w:pPr>
+              <w:spacing w:after="40"/>
+            </w:pPr>
+            <w:r>
+              <w:rPr>
+                <w:sz w:val="19"/>
+              </w:rPr>
+              <w:t>Condition number</w:t>
+            </w:r>
+          </w:p>
+        </w:tc>
+        <w:tc>
+          <w:tcPr>
+            <w:tcW w:type="dxa" w:w="2232"/>
+            <w:vAlign w:val="center"/>
+            <w:tcMar>
+              <w:top w:w="100" w:type="dxa"/>
+              <w:start w:w="100" w:type="dxa"/>
+              <w:bottom w:w="100" w:type="dxa"/>
+              <w:end w:w="100" w:type="dxa"/>
+            </w:tcMar>
+            <w:tcBorders>
+              <w:top w:val="single" w:sz="6" w:color="D9D9D9"/>
+              <w:left w:val="single" w:sz="6" w:color="D9D9D9"/>
+              <w:bottom w:val="single" w:sz="6" w:color="D9D9D9"/>
+              <w:right w:val="single" w:sz="6" w:color="D9D9D9"/>
+              <w:insideH w:val="single" w:sz="6" w:color="D9D9D9"/>
+              <w:insideV w:val="single" w:sz="6" w:color="D9D9D9"/>
+            </w:tcBorders>
+            <w:shd w:fill="EAF2F8"/>
+          </w:tcPr>
+          <w:p>
+            <w:pPr>
+              <w:spacing w:after="40"/>
+            </w:pPr>
+            <w:r>
+              <w:rPr>
+                <w:sz w:val="19"/>
+              </w:rPr>
+            </w:r>
+          </w:p>
+        </w:tc>
+        <w:tc>
+          <w:tcPr>
+            <w:tcW w:type="dxa" w:w="2304"/>
+            <w:vAlign w:val="center"/>
+            <w:tcMar>
+              <w:top w:w="100" w:type="dxa"/>
+              <w:start w:w="100" w:type="dxa"/>
+              <w:bottom w:w="100" w:type="dxa"/>
+              <w:end w:w="100" w:type="dxa"/>
+            </w:tcMar>
+            <w:tcBorders>
+              <w:top w:val="single" w:sz="6" w:color="D9D9D9"/>
+              <w:left w:val="single" w:sz="6" w:color="D9D9D9"/>
+              <w:bottom w:val="single" w:sz="6" w:color="D9D9D9"/>
+              <w:right w:val="single" w:sz="6" w:color="D9D9D9"/>
+              <w:insideH w:val="single" w:sz="6" w:color="D9D9D9"/>
+              <w:insideV w:val="single" w:sz="6" w:color="D9D9D9"/>
+            </w:tcBorders>
+            <w:shd w:fill="EAF2F8"/>
+          </w:tcPr>
+          <w:p>
+            <w:pPr>
+              <w:spacing w:after="40"/>
+            </w:pPr>
+            <w:r>
+              <w:rPr>
+                <w:sz w:val="19"/>
+              </w:rPr>
+            </w:r>
+          </w:p>
+        </w:tc>
+        <w:tc>
+          <w:tcPr>
+            <w:tcW w:type="dxa" w:w="2304"/>
+            <w:vAlign w:val="center"/>
+            <w:tcMar>
+              <w:top w:w="100" w:type="dxa"/>
+              <w:start w:w="100" w:type="dxa"/>
+              <w:bottom w:w="100" w:type="dxa"/>
+              <w:end w:w="100" w:type="dxa"/>
+            </w:tcMar>
+            <w:tcBorders>
+              <w:top w:val="single" w:sz="6" w:color="D9D9D9"/>
+              <w:left w:val="single" w:sz="6" w:color="D9D9D9"/>
+              <w:bottom w:val="single" w:sz="6" w:color="D9D9D9"/>
+              <w:right w:val="single" w:sz="6" w:color="D9D9D9"/>
+              <w:insideH w:val="single" w:sz="6" w:color="D9D9D9"/>
+              <w:insideV w:val="single" w:sz="6" w:color="D9D9D9"/>
+            </w:tcBorders>
+            <w:shd w:fill="EAF2F8"/>
+          </w:tcPr>
+          <w:p>
+            <w:pPr>
+              <w:spacing w:after="40"/>
+            </w:pPr>
+            <w:r>
+              <w:rPr>
+                <w:sz w:val="19"/>
+              </w:rPr>
+            </w:r>
+          </w:p>
+        </w:tc>
+      </w:tr>
+      <w:tr>
+        <w:tc>
+          <w:tcPr>
+            <w:tcW w:type="dxa" w:w="3240"/>
+            <w:vAlign w:val="center"/>
+            <w:tcMar>
+              <w:top w:w="100" w:type="dxa"/>
+              <w:start w:w="100" w:type="dxa"/>
+              <w:bottom w:w="100" w:type="dxa"/>
+              <w:end w:w="100" w:type="dxa"/>
+            </w:tcMar>
+            <w:tcBorders>
+              <w:top w:val="single" w:sz="6" w:color="D9D9D9"/>
+              <w:left w:val="single" w:sz="6" w:color="D9D9D9"/>
+              <w:bottom w:val="single" w:sz="6" w:color="D9D9D9"/>
+              <w:right w:val="single" w:sz="6" w:color="D9D9D9"/>
+              <w:insideH w:val="single" w:sz="6" w:color="D9D9D9"/>
+              <w:insideV w:val="single" w:sz="6" w:color="D9D9D9"/>
+            </w:tcBorders>
+          </w:tcPr>
+          <w:p>
+            <w:pPr>
+              <w:spacing w:after="40"/>
+            </w:pPr>
+            <w:r>
+              <w:rPr>
+                <w:sz w:val="19"/>
+              </w:rPr>
+              <w:t>Raw undamped rate norm in rad/s</w:t>
+            </w:r>
+          </w:p>
+        </w:tc>
+        <w:tc>
+          <w:tcPr>
+            <w:tcW w:type="dxa" w:w="2232"/>
+            <w:vAlign w:val="center"/>
+            <w:tcMar>
+              <w:top w:w="100" w:type="dxa"/>
+              <w:start w:w="100" w:type="dxa"/>
+              <w:bottom w:w="100" w:type="dxa"/>
+              <w:end w:w="100" w:type="dxa"/>
+            </w:tcMar>
+            <w:tcBorders>
+              <w:top w:val="single" w:sz="6" w:color="D9D9D9"/>
+              <w:left w:val="single" w:sz="6" w:color="D9D9D9"/>
+              <w:bottom w:val="single" w:sz="6" w:color="D9D9D9"/>
+              <w:right w:val="single" w:sz="6" w:color="D9D9D9"/>
+              <w:insideH w:val="single" w:sz="6" w:color="D9D9D9"/>
+              <w:insideV w:val="single" w:sz="6" w:color="D9D9D9"/>
+            </w:tcBorders>
+          </w:tcPr>
+          <w:p>
+            <w:pPr>
+              <w:spacing w:after="40"/>
+            </w:pPr>
+            <w:r>
+              <w:rPr>
+                <w:sz w:val="19"/>
+              </w:rPr>
+            </w:r>
+          </w:p>
+        </w:tc>
+        <w:tc>
+          <w:tcPr>
+            <w:tcW w:type="dxa" w:w="2304"/>
+            <w:vAlign w:val="center"/>
+            <w:tcMar>
+              <w:top w:w="100" w:type="dxa"/>
+              <w:start w:w="100" w:type="dxa"/>
+              <w:bottom w:w="100" w:type="dxa"/>
+              <w:end w:w="100" w:type="dxa"/>
+            </w:tcMar>
+            <w:tcBorders>
+              <w:top w:val="single" w:sz="6" w:color="D9D9D9"/>
+              <w:left w:val="single" w:sz="6" w:color="D9D9D9"/>
+              <w:bottom w:val="single" w:sz="6" w:color="D9D9D9"/>
+              <w:right w:val="single" w:sz="6" w:color="D9D9D9"/>
+              <w:insideH w:val="single" w:sz="6" w:color="D9D9D9"/>
+              <w:insideV w:val="single" w:sz="6" w:color="D9D9D9"/>
+            </w:tcBorders>
+          </w:tcPr>
+          <w:p>
+            <w:pPr>
+              <w:spacing w:after="40"/>
+            </w:pPr>
+            <w:r>
+              <w:rPr>
+                <w:sz w:val="19"/>
+              </w:rPr>
+            </w:r>
+          </w:p>
+        </w:tc>
+        <w:tc>
+          <w:tcPr>
+            <w:tcW w:type="dxa" w:w="2304"/>
+            <w:vAlign w:val="center"/>
+            <w:tcMar>
+              <w:top w:w="100" w:type="dxa"/>
+              <w:start w:w="100" w:type="dxa"/>
+              <w:bottom w:w="100" w:type="dxa"/>
+              <w:end w:w="100" w:type="dxa"/>
+            </w:tcMar>
+            <w:tcBorders>
+              <w:top w:val="single" w:sz="6" w:color="D9D9D9"/>
+              <w:left w:val="single" w:sz="6" w:color="D9D9D9"/>
+              <w:bottom w:val="single" w:sz="6" w:color="D9D9D9"/>
+              <w:right w:val="single" w:sz="6" w:color="D9D9D9"/>
+              <w:insideH w:val="single" w:sz="6" w:color="D9D9D9"/>
+              <w:insideV w:val="single" w:sz="6" w:color="D9D9D9"/>
+            </w:tcBorders>
+          </w:tcPr>
+          <w:p>
+            <w:pPr>
+              <w:spacing w:after="40"/>
+            </w:pPr>
+            <w:r>
+              <w:rPr>
+                <w:sz w:val="19"/>
+              </w:rPr>
+            </w:r>
+          </w:p>
+        </w:tc>
+      </w:tr>
+      <w:tr>
+        <w:tc>
+          <w:tcPr>
+            <w:tcW w:type="dxa" w:w="3240"/>
+            <w:vAlign w:val="center"/>
+            <w:tcMar>
+              <w:top w:w="100" w:type="dxa"/>
+              <w:start w:w="100" w:type="dxa"/>
+              <w:bottom w:w="100" w:type="dxa"/>
+              <w:end w:w="100" w:type="dxa"/>
+            </w:tcMar>
+            <w:tcBorders>
+              <w:top w:val="single" w:sz="6" w:color="D9D9D9"/>
+              <w:left w:val="single" w:sz="6" w:color="D9D9D9"/>
+              <w:bottom w:val="single" w:sz="6" w:color="D9D9D9"/>
+              <w:right w:val="single" w:sz="6" w:color="D9D9D9"/>
+              <w:insideH w:val="single" w:sz="6" w:color="D9D9D9"/>
+              <w:insideV w:val="single" w:sz="6" w:color="D9D9D9"/>
+            </w:tcBorders>
+            <w:shd w:fill="EAF2F8"/>
+          </w:tcPr>
+          <w:p>
+            <w:pPr>
+              <w:spacing w:after="40"/>
+            </w:pPr>
+            <w:r>
+              <w:rPr>
+                <w:sz w:val="19"/>
+              </w:rPr>
+              <w:t>Applied rate-vector norm in rad/s</w:t>
+            </w:r>
+          </w:p>
+        </w:tc>
+        <w:tc>
+          <w:tcPr>
+            <w:tcW w:type="dxa" w:w="2232"/>
+            <w:vAlign w:val="center"/>
+            <w:tcMar>
+              <w:top w:w="100" w:type="dxa"/>
+              <w:start w:w="100" w:type="dxa"/>
+              <w:bottom w:w="100" w:type="dxa"/>
+              <w:end w:w="100" w:type="dxa"/>
+            </w:tcMar>
+            <w:tcBorders>
+              <w:top w:val="single" w:sz="6" w:color="D9D9D9"/>
+              <w:left w:val="single" w:sz="6" w:color="D9D9D9"/>
+              <w:bottom w:val="single" w:sz="6" w:color="D9D9D9"/>
+              <w:right w:val="single" w:sz="6" w:color="D9D9D9"/>
+              <w:insideH w:val="single" w:sz="6" w:color="D9D9D9"/>
+              <w:insideV w:val="single" w:sz="6" w:color="D9D9D9"/>
+            </w:tcBorders>
+            <w:shd w:fill="EAF2F8"/>
+          </w:tcPr>
+          <w:p>
+            <w:pPr>
+              <w:spacing w:after="40"/>
+            </w:pPr>
+            <w:r>
+              <w:rPr>
+                <w:sz w:val="19"/>
+              </w:rPr>
+            </w:r>
+          </w:p>
+        </w:tc>
+        <w:tc>
+          <w:tcPr>
+            <w:tcW w:type="dxa" w:w="2304"/>
+            <w:vAlign w:val="center"/>
+            <w:tcMar>
+              <w:top w:w="100" w:type="dxa"/>
+              <w:start w:w="100" w:type="dxa"/>
+              <w:bottom w:w="100" w:type="dxa"/>
+              <w:end w:w="100" w:type="dxa"/>
+            </w:tcMar>
+            <w:tcBorders>
+              <w:top w:val="single" w:sz="6" w:color="D9D9D9"/>
+              <w:left w:val="single" w:sz="6" w:color="D9D9D9"/>
+              <w:bottom w:val="single" w:sz="6" w:color="D9D9D9"/>
+              <w:right w:val="single" w:sz="6" w:color="D9D9D9"/>
+              <w:insideH w:val="single" w:sz="6" w:color="D9D9D9"/>
+              <w:insideV w:val="single" w:sz="6" w:color="D9D9D9"/>
+            </w:tcBorders>
+            <w:shd w:fill="EAF2F8"/>
+          </w:tcPr>
+          <w:p>
+            <w:pPr>
+              <w:spacing w:after="40"/>
+            </w:pPr>
+            <w:r>
+              <w:rPr>
+                <w:sz w:val="19"/>
+              </w:rPr>
+            </w:r>
+          </w:p>
+        </w:tc>
+        <w:tc>
+          <w:tcPr>
+            <w:tcW w:type="dxa" w:w="2304"/>
+            <w:vAlign w:val="center"/>
+            <w:tcMar>
+              <w:top w:w="100" w:type="dxa"/>
+              <w:start w:w="100" w:type="dxa"/>
+              <w:bottom w:w="100" w:type="dxa"/>
+              <w:end w:w="100" w:type="dxa"/>
+            </w:tcMar>
+            <w:tcBorders>
+              <w:top w:val="single" w:sz="6" w:color="D9D9D9"/>
+              <w:left w:val="single" w:sz="6" w:color="D9D9D9"/>
+              <w:bottom w:val="single" w:sz="6" w:color="D9D9D9"/>
+              <w:right w:val="single" w:sz="6" w:color="D9D9D9"/>
+              <w:insideH w:val="single" w:sz="6" w:color="D9D9D9"/>
+              <w:insideV w:val="single" w:sz="6" w:color="D9D9D9"/>
+            </w:tcBorders>
+            <w:shd w:fill="EAF2F8"/>
+          </w:tcPr>
+          <w:p>
+            <w:pPr>
+              <w:spacing w:after="40"/>
+            </w:pPr>
+            <w:r>
+              <w:rPr>
+                <w:sz w:val="19"/>
+              </w:rPr>
+            </w:r>
+          </w:p>
+        </w:tc>
+      </w:tr>
+      <w:tr>
+        <w:tc>
+          <w:tcPr>
+            <w:tcW w:type="dxa" w:w="3240"/>
+            <w:vAlign w:val="center"/>
+            <w:tcMar>
+              <w:top w:w="100" w:type="dxa"/>
+              <w:start w:w="100" w:type="dxa"/>
+              <w:bottom w:w="100" w:type="dxa"/>
+              <w:end w:w="100" w:type="dxa"/>
+            </w:tcMar>
+            <w:tcBorders>
+              <w:top w:val="single" w:sz="6" w:color="D9D9D9"/>
+              <w:left w:val="single" w:sz="6" w:color="D9D9D9"/>
+              <w:bottom w:val="single" w:sz="6" w:color="D9D9D9"/>
+              <w:right w:val="single" w:sz="6" w:color="D9D9D9"/>
+              <w:insideH w:val="single" w:sz="6" w:color="D9D9D9"/>
+              <w:insideV w:val="single" w:sz="6" w:color="D9D9D9"/>
+            </w:tcBorders>
+          </w:tcPr>
+          <w:p>
+            <w:pPr>
+              <w:spacing w:after="40"/>
+            </w:pPr>
+            <w:r>
+              <w:rPr>
+                <w:sz w:val="19"/>
+              </w:rPr>
+              <w:t>Safety scale</w:t>
+            </w:r>
+          </w:p>
+        </w:tc>
+        <w:tc>
+          <w:tcPr>
+            <w:tcW w:type="dxa" w:w="2232"/>
+            <w:vAlign w:val="center"/>
+            <w:tcMar>
+              <w:top w:w="100" w:type="dxa"/>
+              <w:start w:w="100" w:type="dxa"/>
+              <w:bottom w:w="100" w:type="dxa"/>
+              <w:end w:w="100" w:type="dxa"/>
+            </w:tcMar>
+            <w:tcBorders>
+              <w:top w:val="single" w:sz="6" w:color="D9D9D9"/>
+              <w:left w:val="single" w:sz="6" w:color="D9D9D9"/>
+              <w:bottom w:val="single" w:sz="6" w:color="D9D9D9"/>
+              <w:right w:val="single" w:sz="6" w:color="D9D9D9"/>
+              <w:insideH w:val="single" w:sz="6" w:color="D9D9D9"/>
+              <w:insideV w:val="single" w:sz="6" w:color="D9D9D9"/>
+            </w:tcBorders>
+          </w:tcPr>
+          <w:p>
+            <w:pPr>
+              <w:spacing w:after="40"/>
+            </w:pPr>
+            <w:r>
+              <w:rPr>
+                <w:sz w:val="19"/>
+              </w:rPr>
+            </w:r>
+          </w:p>
+        </w:tc>
+        <w:tc>
+          <w:tcPr>
+            <w:tcW w:type="dxa" w:w="2304"/>
+            <w:vAlign w:val="center"/>
+            <w:tcMar>
+              <w:top w:w="100" w:type="dxa"/>
+              <w:start w:w="100" w:type="dxa"/>
+              <w:bottom w:w="100" w:type="dxa"/>
+              <w:end w:w="100" w:type="dxa"/>
+            </w:tcMar>
+            <w:tcBorders>
+              <w:top w:val="single" w:sz="6" w:color="D9D9D9"/>
+              <w:left w:val="single" w:sz="6" w:color="D9D9D9"/>
+              <w:bottom w:val="single" w:sz="6" w:color="D9D9D9"/>
+              <w:right w:val="single" w:sz="6" w:color="D9D9D9"/>
+              <w:insideH w:val="single" w:sz="6" w:color="D9D9D9"/>
+              <w:insideV w:val="single" w:sz="6" w:color="D9D9D9"/>
+            </w:tcBorders>
+          </w:tcPr>
+          <w:p>
+            <w:pPr>
+              <w:spacing w:after="40"/>
+            </w:pPr>
+            <w:r>
+              <w:rPr>
+                <w:sz w:val="19"/>
+              </w:rPr>
+            </w:r>
+          </w:p>
+        </w:tc>
+        <w:tc>
+          <w:tcPr>
+            <w:tcW w:type="dxa" w:w="2304"/>
+            <w:vAlign w:val="center"/>
+            <w:tcMar>
+              <w:top w:w="100" w:type="dxa"/>
+              <w:start w:w="100" w:type="dxa"/>
+              <w:bottom w:w="100" w:type="dxa"/>
+              <w:end w:w="100" w:type="dxa"/>
+            </w:tcMar>
+            <w:tcBorders>
+              <w:top w:val="single" w:sz="6" w:color="D9D9D9"/>
+              <w:left w:val="single" w:sz="6" w:color="D9D9D9"/>
+              <w:bottom w:val="single" w:sz="6" w:color="D9D9D9"/>
+              <w:right w:val="single" w:sz="6" w:color="D9D9D9"/>
+              <w:insideH w:val="single" w:sz="6" w:color="D9D9D9"/>
+              <w:insideV w:val="single" w:sz="6" w:color="D9D9D9"/>
+            </w:tcBorders>
+          </w:tcPr>
+          <w:p>
+            <w:pPr>
+              <w:spacing w:after="40"/>
+            </w:pPr>
+            <w:r>
+              <w:rPr>
+                <w:sz w:val="19"/>
+              </w:rPr>
+            </w:r>
+          </w:p>
+        </w:tc>
+      </w:tr>
+      <w:tr>
+        <w:tc>
+          <w:tcPr>
+            <w:tcW w:type="dxa" w:w="3240"/>
+            <w:vAlign w:val="center"/>
+            <w:tcMar>
+              <w:top w:w="100" w:type="dxa"/>
+              <w:start w:w="100" w:type="dxa"/>
+              <w:bottom w:w="100" w:type="dxa"/>
+              <w:end w:w="100" w:type="dxa"/>
+            </w:tcMar>
+            <w:tcBorders>
+              <w:top w:val="single" w:sz="6" w:color="D9D9D9"/>
+              <w:left w:val="single" w:sz="6" w:color="D9D9D9"/>
+              <w:bottom w:val="single" w:sz="6" w:color="D9D9D9"/>
+              <w:right w:val="single" w:sz="6" w:color="D9D9D9"/>
+              <w:insideH w:val="single" w:sz="6" w:color="D9D9D9"/>
+              <w:insideV w:val="single" w:sz="6" w:color="D9D9D9"/>
+            </w:tcBorders>
+            <w:shd w:fill="EAF2F8"/>
+          </w:tcPr>
+          <w:p>
+            <w:pPr>
+              <w:spacing w:after="40"/>
+            </w:pPr>
+            <w:r>
+              <w:rPr>
+                <w:sz w:val="19"/>
+              </w:rPr>
+              <w:t>Measured translation magnitude in m</w:t>
+            </w:r>
+          </w:p>
+        </w:tc>
+        <w:tc>
+          <w:tcPr>
+            <w:tcW w:type="dxa" w:w="2232"/>
+            <w:vAlign w:val="center"/>
+            <w:tcMar>
+              <w:top w:w="100" w:type="dxa"/>
+              <w:start w:w="100" w:type="dxa"/>
+              <w:bottom w:w="100" w:type="dxa"/>
+              <w:end w:w="100" w:type="dxa"/>
+            </w:tcMar>
+            <w:tcBorders>
+              <w:top w:val="single" w:sz="6" w:color="D9D9D9"/>
+              <w:left w:val="single" w:sz="6" w:color="D9D9D9"/>
+              <w:bottom w:val="single" w:sz="6" w:color="D9D9D9"/>
+              <w:right w:val="single" w:sz="6" w:color="D9D9D9"/>
+              <w:insideH w:val="single" w:sz="6" w:color="D9D9D9"/>
+              <w:insideV w:val="single" w:sz="6" w:color="D9D9D9"/>
+            </w:tcBorders>
+            <w:shd w:fill="EAF2F8"/>
+          </w:tcPr>
+          <w:p>
+            <w:pPr>
+              <w:spacing w:after="40"/>
+            </w:pPr>
+            <w:r>
+              <w:rPr>
+                <w:sz w:val="19"/>
+              </w:rPr>
+            </w:r>
+          </w:p>
+        </w:tc>
+        <w:tc>
+          <w:tcPr>
+            <w:tcW w:type="dxa" w:w="2304"/>
+            <w:vAlign w:val="center"/>
+            <w:tcMar>
+              <w:top w:w="100" w:type="dxa"/>
+              <w:start w:w="100" w:type="dxa"/>
+              <w:bottom w:w="100" w:type="dxa"/>
+              <w:end w:w="100" w:type="dxa"/>
+            </w:tcMar>
+            <w:tcBorders>
+              <w:top w:val="single" w:sz="6" w:color="D9D9D9"/>
+              <w:left w:val="single" w:sz="6" w:color="D9D9D9"/>
+              <w:bottom w:val="single" w:sz="6" w:color="D9D9D9"/>
+              <w:right w:val="single" w:sz="6" w:color="D9D9D9"/>
+              <w:insideH w:val="single" w:sz="6" w:color="D9D9D9"/>
+              <w:insideV w:val="single" w:sz="6" w:color="D9D9D9"/>
+            </w:tcBorders>
+            <w:shd w:fill="EAF2F8"/>
+          </w:tcPr>
+          <w:p>
+            <w:pPr>
+              <w:spacing w:after="40"/>
+            </w:pPr>
+            <w:r>
+              <w:rPr>
+                <w:sz w:val="19"/>
+              </w:rPr>
+            </w:r>
+          </w:p>
+        </w:tc>
+        <w:tc>
+          <w:tcPr>
+            <w:tcW w:type="dxa" w:w="2304"/>
+            <w:vAlign w:val="center"/>
+            <w:tcMar>
+              <w:top w:w="100" w:type="dxa"/>
+              <w:start w:w="100" w:type="dxa"/>
+              <w:bottom w:w="100" w:type="dxa"/>
+              <w:end w:w="100" w:type="dxa"/>
+            </w:tcMar>
+            <w:tcBorders>
+              <w:top w:val="single" w:sz="6" w:color="D9D9D9"/>
+              <w:left w:val="single" w:sz="6" w:color="D9D9D9"/>
+              <w:bottom w:val="single" w:sz="6" w:color="D9D9D9"/>
+              <w:right w:val="single" w:sz="6" w:color="D9D9D9"/>
+              <w:insideH w:val="single" w:sz="6" w:color="D9D9D9"/>
+              <w:insideV w:val="single" w:sz="6" w:color="D9D9D9"/>
+            </w:tcBorders>
+            <w:shd w:fill="EAF2F8"/>
+          </w:tcPr>
+          <w:p>
+            <w:pPr>
+              <w:spacing w:after="40"/>
+            </w:pPr>
+            <w:r>
+              <w:rPr>
+                <w:sz w:val="19"/>
+              </w:rPr>
             </w:r>
           </w:p>
         </w:tc>
@@ -272,71 +1002,105 @@
         <w:pStyle w:val="Heading1"/>
       </w:pPr>
       <w:r>
-        <w:t>2. Differential motion</w:t>
+        <w:t>Webots Evidence</w:t>
+      </w:r>
+    </w:p>
+    <w:p>
+      <w:r>
+        <w:t>Insert one screenshot from each trial. Show the complete robot pose and include readable console output in at least one screenshot.</w:t>
       </w:r>
     </w:p>
     <w:p>
       <w:pPr>
-        <w:spacing w:before="100" w:after="60"/>
+        <w:pStyle w:val="Heading2"/>
       </w:pPr>
       <w:r>
-        <w:rPr>
-          <w:rFonts w:ascii="Arial" w:hAnsi="Arial"/>
-          <w:b/>
-          <w:i w:val="0"/>
-          <w:color w:val="000000"/>
-          <w:sz w:val="22"/>
-        </w:rPr>
-        <w:t>Requested, predicted, and measured motion</w:t>
+        <w:t>Trial 1 Bent Elbow Undamped</w:t>
       </w:r>
     </w:p>
     <w:tbl>
       <w:tblPr>
-        <w:tblW w:type="dxa" w:w="9360"/>
-        <w:tblLayout w:type="fixed"/>
+        <w:tblW w:type="auto" w:w="0"/>
         <w:tblLook w:firstColumn="1" w:firstRow="1" w:lastColumn="0" w:lastRow="0" w:noHBand="0" w:noVBand="1" w:val="04A0"/>
-        <w:tblInd w:w="0" w:type="dxa"/>
-        <w:tblBorders>
-          <w:top w:val="single" w:sz="4" w:color="DADCE0"/>
-          <w:left w:val="single" w:sz="4" w:color="DADCE0"/>
-          <w:bottom w:val="single" w:sz="4" w:color="DADCE0"/>
-          <w:right w:val="single" w:sz="4" w:color="DADCE0"/>
-          <w:insideH w:val="nil"/>
-          <w:insideV w:val="nil"/>
-        </w:tblBorders>
       </w:tblPr>
       <w:tblGrid>
-        <w:gridCol w:w="9360"/>
+        <w:gridCol w:w="10080"/>
       </w:tblGrid>
       <w:tr>
-        <w:trPr>
-          <w:trHeight w:val="2448" w:hRule="atLeast"/>
-        </w:trPr>
         <w:tc>
           <w:tcPr>
-            <w:tcW w:type="dxa" w:w="9360"/>
+            <w:tcW w:type="dxa" w:w="10080"/>
+            <w:vAlign w:val="center"/>
+            <w:tcBorders>
+              <w:top w:val="single" w:sz="8" w:color="A6A6A6"/>
+              <w:left w:val="single" w:sz="8" w:color="A6A6A6"/>
+              <w:bottom w:val="single" w:sz="8" w:color="A6A6A6"/>
+              <w:right w:val="single" w:sz="8" w:color="A6A6A6"/>
+              <w:insideH w:val="single" w:sz="8" w:color="A6A6A6"/>
+              <w:insideV w:val="single" w:sz="8" w:color="A6A6A6"/>
+            </w:tcBorders>
             <w:tcMar>
-              <w:top w:w="100" w:type="dxa"/>
-              <w:bottom w:w="100" w:type="dxa"/>
-              <w:start w:w="120" w:type="dxa"/>
-              <w:end w:w="120" w:type="dxa"/>
+              <w:top w:w="150" w:type="dxa"/>
+              <w:start w:w="150" w:type="dxa"/>
+              <w:bottom w:w="150" w:type="dxa"/>
+              <w:end w:w="150" w:type="dxa"/>
             </w:tcMar>
-            <w:vAlign w:val="top"/>
           </w:tcPr>
           <w:p>
             <w:pPr>
-              <w:spacing w:after="0"/>
-              <w:jc w:val="left"/>
+              <w:spacing w:before="1360" w:after="1360"/>
+              <w:jc w:val="center"/>
             </w:pPr>
             <w:r>
-              <w:rPr>
-                <w:rFonts w:ascii="Consolas" w:hAnsi="Consolas"/>
-                <w:b w:val="0"/>
-                <w:i/>
-                <w:color w:val="555555"/>
-                <w:sz w:val="19"/>
-              </w:rPr>
-              <w:t>Paste the well-conditioned-pose results and compare the three tool motions.</w:t>
+              <w:t>Replace this text with the Trial 1 Webots screenshot</w:t>
+            </w:r>
+          </w:p>
+        </w:tc>
+      </w:tr>
+    </w:tbl>
+    <w:p>
+      <w:pPr>
+        <w:pStyle w:val="Heading2"/>
+      </w:pPr>
+      <w:r>
+        <w:t>Trial 2 Near Singular Undamped</w:t>
+      </w:r>
+    </w:p>
+    <w:tbl>
+      <w:tblPr>
+        <w:tblW w:type="auto" w:w="0"/>
+        <w:tblLook w:firstColumn="1" w:firstRow="1" w:lastColumn="0" w:lastRow="0" w:noHBand="0" w:noVBand="1" w:val="04A0"/>
+      </w:tblPr>
+      <w:tblGrid>
+        <w:gridCol w:w="10080"/>
+      </w:tblGrid>
+      <w:tr>
+        <w:tc>
+          <w:tcPr>
+            <w:tcW w:type="dxa" w:w="10080"/>
+            <w:vAlign w:val="center"/>
+            <w:tcBorders>
+              <w:top w:val="single" w:sz="8" w:color="A6A6A6"/>
+              <w:left w:val="single" w:sz="8" w:color="A6A6A6"/>
+              <w:bottom w:val="single" w:sz="8" w:color="A6A6A6"/>
+              <w:right w:val="single" w:sz="8" w:color="A6A6A6"/>
+              <w:insideH w:val="single" w:sz="8" w:color="A6A6A6"/>
+              <w:insideV w:val="single" w:sz="8" w:color="A6A6A6"/>
+            </w:tcBorders>
+            <w:tcMar>
+              <w:top w:w="150" w:type="dxa"/>
+              <w:start w:w="150" w:type="dxa"/>
+              <w:bottom w:w="150" w:type="dxa"/>
+              <w:end w:w="150" w:type="dxa"/>
+            </w:tcMar>
+          </w:tcPr>
+          <w:p>
+            <w:pPr>
+              <w:spacing w:before="1360" w:after="1360"/>
+              <w:jc w:val="center"/>
+            </w:pPr>
+            <w:r>
+              <w:t>Replace this text with the Trial 2 Webots screenshot</w:t>
             </w:r>
           </w:p>
         </w:tc>
@@ -352,71 +1116,52 @@
         <w:pStyle w:val="Heading1"/>
       </w:pPr>
       <w:r>
-        <w:t>3. Singularity analysis</w:t>
+        <w:t>Damped Comparison</w:t>
       </w:r>
     </w:p>
     <w:p>
       <w:pPr>
-        <w:spacing w:before="100" w:after="60"/>
+        <w:pStyle w:val="Heading2"/>
       </w:pPr>
       <w:r>
-        <w:rPr>
-          <w:rFonts w:ascii="Arial" w:hAnsi="Arial"/>
-          <w:b/>
-          <w:i w:val="0"/>
-          <w:color w:val="000000"/>
-          <w:sz w:val="22"/>
-        </w:rPr>
-        <w:t>Normal and near-singular results</w:t>
+        <w:t>Trial 3 Near Singular Damped</w:t>
       </w:r>
     </w:p>
     <w:tbl>
       <w:tblPr>
-        <w:tblW w:type="dxa" w:w="9360"/>
-        <w:tblLayout w:type="fixed"/>
+        <w:tblW w:type="auto" w:w="0"/>
         <w:tblLook w:firstColumn="1" w:firstRow="1" w:lastColumn="0" w:lastRow="0" w:noHBand="0" w:noVBand="1" w:val="04A0"/>
-        <w:tblInd w:w="0" w:type="dxa"/>
-        <w:tblBorders>
-          <w:top w:val="single" w:sz="4" w:color="DADCE0"/>
-          <w:left w:val="single" w:sz="4" w:color="DADCE0"/>
-          <w:bottom w:val="single" w:sz="4" w:color="DADCE0"/>
-          <w:right w:val="single" w:sz="4" w:color="DADCE0"/>
-          <w:insideH w:val="nil"/>
-          <w:insideV w:val="nil"/>
-        </w:tblBorders>
       </w:tblPr>
       <w:tblGrid>
-        <w:gridCol w:w="9360"/>
+        <w:gridCol w:w="10080"/>
       </w:tblGrid>
       <w:tr>
-        <w:trPr>
-          <w:trHeight w:val="2880" w:hRule="atLeast"/>
-        </w:trPr>
         <w:tc>
           <w:tcPr>
-            <w:tcW w:type="dxa" w:w="9360"/>
+            <w:tcW w:type="dxa" w:w="10080"/>
+            <w:vAlign w:val="center"/>
+            <w:tcBorders>
+              <w:top w:val="single" w:sz="8" w:color="A6A6A6"/>
+              <w:left w:val="single" w:sz="8" w:color="A6A6A6"/>
+              <w:bottom w:val="single" w:sz="8" w:color="A6A6A6"/>
+              <w:right w:val="single" w:sz="8" w:color="A6A6A6"/>
+              <w:insideH w:val="single" w:sz="8" w:color="A6A6A6"/>
+              <w:insideV w:val="single" w:sz="8" w:color="A6A6A6"/>
+            </w:tcBorders>
             <w:tcMar>
-              <w:top w:w="100" w:type="dxa"/>
-              <w:bottom w:w="100" w:type="dxa"/>
-              <w:start w:w="120" w:type="dxa"/>
-              <w:end w:w="120" w:type="dxa"/>
+              <w:top w:w="150" w:type="dxa"/>
+              <w:start w:w="150" w:type="dxa"/>
+              <w:bottom w:w="150" w:type="dxa"/>
+              <w:end w:w="150" w:type="dxa"/>
             </w:tcMar>
-            <w:vAlign w:val="top"/>
           </w:tcPr>
           <w:p>
             <w:pPr>
-              <w:spacing w:after="0"/>
-              <w:jc w:val="left"/>
+              <w:spacing w:before="1360" w:after="1360"/>
+              <w:jc w:val="center"/>
             </w:pPr>
             <w:r>
-              <w:rPr>
-                <w:rFonts w:ascii="Consolas" w:hAnsi="Consolas"/>
-                <w:b w:val="0"/>
-                <w:i/>
-                <w:color w:val="555555"/>
-                <w:sz w:val="19"/>
-              </w:rPr>
-              <w:t>Paste singular values, rank, condition number, manipulability, joint-rate norm, and tracking error for both poses.</w:t>
+              <w:t>Replace this text with the Trial 3 Webots screenshot</w:t>
             </w:r>
           </w:p>
         </w:tc>
@@ -424,138 +1169,62 @@
     </w:tbl>
     <w:p>
       <w:pPr>
-        <w:spacing w:before="100" w:after="60"/>
+        <w:pStyle w:val="Heading2"/>
       </w:pPr>
       <w:r>
-        <w:rPr>
-          <w:rFonts w:ascii="Arial" w:hAnsi="Arial"/>
-          <w:b/>
-          <w:i w:val="0"/>
-          <w:color w:val="000000"/>
-          <w:sz w:val="22"/>
-        </w:rPr>
-        <w:t>Damping comparison</w:t>
+        <w:t>Trial 2 and Trial 3 Observation</w:t>
       </w:r>
     </w:p>
-    <w:tbl>
-      <w:tblPr>
-        <w:tblW w:type="dxa" w:w="9360"/>
-        <w:tblLayout w:type="fixed"/>
-        <w:tblLook w:firstColumn="1" w:firstRow="1" w:lastColumn="0" w:lastRow="0" w:noHBand="0" w:noVBand="1" w:val="04A0"/>
-        <w:tblInd w:w="0" w:type="dxa"/>
-        <w:tblBorders>
-          <w:top w:val="single" w:sz="4" w:color="DADCE0"/>
-          <w:left w:val="single" w:sz="4" w:color="DADCE0"/>
-          <w:bottom w:val="single" w:sz="4" w:color="DADCE0"/>
-          <w:right w:val="single" w:sz="4" w:color="DADCE0"/>
-          <w:insideH w:val="nil"/>
-          <w:insideV w:val="nil"/>
-        </w:tblBorders>
-      </w:tblPr>
-      <w:tblGrid>
-        <w:gridCol w:w="9360"/>
-      </w:tblGrid>
-      <w:tr>
-        <w:trPr>
-          <w:trHeight w:val="1728" w:hRule="atLeast"/>
-        </w:trPr>
-        <w:tc>
-          <w:tcPr>
-            <w:tcW w:type="dxa" w:w="9360"/>
-            <w:tcMar>
-              <w:top w:w="100" w:type="dxa"/>
-              <w:bottom w:w="100" w:type="dxa"/>
-              <w:start w:w="120" w:type="dxa"/>
-              <w:end w:w="120" w:type="dxa"/>
-            </w:tcMar>
-            <w:vAlign w:val="top"/>
-          </w:tcPr>
-          <w:p>
-            <w:pPr>
-              <w:spacing w:after="0"/>
-              <w:jc w:val="left"/>
-            </w:pPr>
-            <w:r>
-              <w:rPr>
-                <w:rFonts w:ascii="Arial" w:hAnsi="Arial"/>
-                <w:b w:val="0"/>
-                <w:i/>
-                <w:color w:val="555555"/>
-                <w:sz w:val="20"/>
-              </w:rPr>
-              <w:t>Paste the damped and undamped results and explain the physical direction of lost mobility.</w:t>
-            </w:r>
-          </w:p>
-        </w:tc>
-      </w:tr>
-    </w:tbl>
+    <w:p>
+      <w:r>
+        <w:t>Describe the visible difference in joint motion and tool displacement. Remember that both trials start from the same robot configuration.</w:t>
+      </w:r>
+    </w:p>
     <w:p>
       <w:pPr>
-        <w:spacing w:before="100" w:after="60"/>
+        <w:keepLines/>
+        <w:spacing w:after="100"/>
       </w:pPr>
       <w:r>
-        <w:rPr>
-          <w:rFonts w:ascii="Arial" w:hAnsi="Arial"/>
-          <w:b/>
-          <w:i w:val="0"/>
-          <w:color w:val="000000"/>
-          <w:sz w:val="22"/>
-        </w:rPr>
-        <w:t>Plot</w:t>
+        <w:t>________________________________________________________________________________</w:t>
       </w:r>
     </w:p>
-    <w:tbl>
-      <w:tblPr>
-        <w:tblW w:type="dxa" w:w="9360"/>
-        <w:tblLayout w:type="fixed"/>
-        <w:tblLook w:firstColumn="1" w:firstRow="1" w:lastColumn="0" w:lastRow="0" w:noHBand="0" w:noVBand="1" w:val="04A0"/>
-        <w:tblInd w:w="0" w:type="dxa"/>
-        <w:tblBorders>
-          <w:top w:val="single" w:sz="4" w:color="DADCE0"/>
-          <w:left w:val="single" w:sz="4" w:color="DADCE0"/>
-          <w:bottom w:val="single" w:sz="4" w:color="DADCE0"/>
-          <w:right w:val="single" w:sz="4" w:color="DADCE0"/>
-          <w:insideH w:val="nil"/>
-          <w:insideV w:val="nil"/>
-        </w:tblBorders>
-      </w:tblPr>
-      <w:tblGrid>
-        <w:gridCol w:w="9360"/>
-      </w:tblGrid>
-      <w:tr>
-        <w:trPr>
-          <w:trHeight w:val="2448" w:hRule="atLeast"/>
-        </w:trPr>
-        <w:tc>
-          <w:tcPr>
-            <w:tcW w:type="dxa" w:w="9360"/>
-            <w:tcMar>
-              <w:top w:w="100" w:type="dxa"/>
-              <w:bottom w:w="100" w:type="dxa"/>
-              <w:start w:w="120" w:type="dxa"/>
-              <w:end w:w="120" w:type="dxa"/>
-            </w:tcMar>
-            <w:vAlign w:val="center"/>
-          </w:tcPr>
-          <w:p>
-            <w:pPr>
-              <w:spacing w:after="0"/>
-              <w:jc w:val="center"/>
-            </w:pPr>
-            <w:r>
-              <w:rPr>
-                <w:rFonts w:ascii="Arial" w:hAnsi="Arial"/>
-                <w:b w:val="0"/>
-                <w:i/>
-                <w:color w:val="555555"/>
-                <w:sz w:val="20"/>
-              </w:rPr>
-              <w:t>Insert the singularity metric plot.</w:t>
-            </w:r>
-          </w:p>
-        </w:tc>
-      </w:tr>
-    </w:tbl>
+    <w:p>
+      <w:pPr>
+        <w:keepLines/>
+        <w:spacing w:after="100"/>
+      </w:pPr>
+      <w:r>
+        <w:t>________________________________________________________________________________</w:t>
+      </w:r>
+    </w:p>
+    <w:p>
+      <w:pPr>
+        <w:keepLines/>
+        <w:spacing w:after="100"/>
+      </w:pPr>
+      <w:r>
+        <w:t>________________________________________________________________________________</w:t>
+      </w:r>
+    </w:p>
+    <w:p>
+      <w:pPr>
+        <w:keepLines/>
+        <w:spacing w:after="100"/>
+      </w:pPr>
+      <w:r>
+        <w:t>________________________________________________________________________________</w:t>
+      </w:r>
+    </w:p>
+    <w:p>
+      <w:pPr>
+        <w:keepLines/>
+        <w:spacing w:after="100"/>
+      </w:pPr>
+      <w:r>
+        <w:t>________________________________________________________________________________</w:t>
+      </w:r>
+    </w:p>
     <w:p>
       <w:r>
         <w:br w:type="page"/>
@@ -566,105 +1235,168 @@
         <w:pStyle w:val="Heading1"/>
       </w:pPr>
       <w:r>
-        <w:t>4. Engineering question</w:t>
+        <w:t>Questions</w:t>
+      </w:r>
+    </w:p>
+    <w:p>
+      <w:r>
+        <w:t>Answer each question in two or three sentences and refer to your recorded results.</w:t>
       </w:r>
     </w:p>
     <w:p>
       <w:pPr>
-        <w:spacing w:before="120" w:after="60"/>
+        <w:pStyle w:val="Heading2"/>
       </w:pPr>
       <w:r>
-        <w:t>As the minimum singular value decreases, what happens to the required joint-rate magnitude, and how does damping change the commanded motion? Refer to your measured results.</w:t>
+        <w:t>1  Which configuration was closer to a singularity  Support your answer using the minimum singular value and condition number</w:t>
       </w:r>
     </w:p>
     <w:p>
       <w:pPr>
-        <w:spacing w:before="100" w:after="60"/>
+        <w:keepLines/>
+        <w:spacing w:after="100"/>
       </w:pPr>
       <w:r>
-        <w:t>Answer in 2-3 sentences.</w:t>
+        <w:t>________________________________________________________________________________</w:t>
       </w:r>
     </w:p>
-    <w:tbl>
-      <w:tblPr>
-        <w:tblW w:type="dxa" w:w="9360"/>
-        <w:tblLayout w:type="fixed"/>
-        <w:tblLook w:firstColumn="1" w:firstRow="1" w:lastColumn="0" w:lastRow="0" w:noHBand="0" w:noVBand="1" w:val="04A0"/>
-        <w:tblInd w:w="0" w:type="dxa"/>
-        <w:tblBorders>
-          <w:top w:val="single" w:sz="4" w:color="DADCE0"/>
-          <w:left w:val="single" w:sz="4" w:color="DADCE0"/>
-          <w:bottom w:val="single" w:sz="4" w:color="DADCE0"/>
-          <w:right w:val="single" w:sz="4" w:color="DADCE0"/>
-          <w:insideH w:val="nil"/>
-          <w:insideV w:val="nil"/>
-        </w:tblBorders>
-      </w:tblPr>
-      <w:tblGrid>
-        <w:gridCol w:w="9360"/>
-      </w:tblGrid>
-      <w:tr>
-        <w:trPr>
-          <w:trHeight w:val="936" w:hRule="atLeast"/>
-        </w:trPr>
-        <w:tc>
-          <w:tcPr>
-            <w:tcW w:type="dxa" w:w="9360"/>
-            <w:tcMar>
-              <w:top w:w="100" w:type="dxa"/>
-              <w:bottom w:w="100" w:type="dxa"/>
-              <w:start w:w="120" w:type="dxa"/>
-              <w:end w:w="120" w:type="dxa"/>
-            </w:tcMar>
-            <w:vAlign w:val="top"/>
-          </w:tcPr>
-          <w:p>
-            <w:pPr>
-              <w:spacing w:after="0"/>
-              <w:jc w:val="left"/>
-            </w:pPr>
-            <w:r>
-              <w:rPr>
-                <w:rFonts w:ascii="Arial" w:hAnsi="Arial"/>
-                <w:b w:val="0"/>
-                <w:i/>
-                <w:color w:val="555555"/>
-                <w:sz w:val="20"/>
-              </w:rPr>
-              <w:t>Type your answer here.</w:t>
-            </w:r>
-          </w:p>
-        </w:tc>
-      </w:tr>
-    </w:tbl>
     <w:p>
       <w:pPr>
-        <w:spacing w:before="240" w:after="0"/>
+        <w:keepLines/>
+        <w:spacing w:after="100"/>
       </w:pPr>
       <w:r>
+        <w:t>________________________________________________________________________________</w:t>
+      </w:r>
+    </w:p>
+    <w:p>
+      <w:pPr>
+        <w:keepLines/>
+        <w:spacing w:after="100"/>
+      </w:pPr>
+      <w:r>
+        <w:t>________________________________________________________________________________</w:t>
+      </w:r>
+    </w:p>
+    <w:p>
+      <w:pPr>
+        <w:pStyle w:val="Heading2"/>
+      </w:pPr>
+      <w:r>
+        <w:t>2  In Trial 2 why did the raw undamped inverse request large joint rates even though the requested translation was only 6 cm</w:t>
+      </w:r>
+    </w:p>
+    <w:p>
+      <w:pPr>
+        <w:keepLines/>
+        <w:spacing w:after="100"/>
+      </w:pPr>
+      <w:r>
+        <w:t>________________________________________________________________________________</w:t>
+      </w:r>
+    </w:p>
+    <w:p>
+      <w:pPr>
+        <w:keepLines/>
+        <w:spacing w:after="100"/>
+      </w:pPr>
+      <w:r>
+        <w:t>________________________________________________________________________________</w:t>
+      </w:r>
+    </w:p>
+    <w:p>
+      <w:pPr>
+        <w:keepLines/>
+        <w:spacing w:after="100"/>
+      </w:pPr>
+      <w:r>
+        <w:t>________________________________________________________________________________</w:t>
+      </w:r>
+    </w:p>
+    <w:p>
+      <w:pPr>
+        <w:pStyle w:val="Heading2"/>
+      </w:pPr>
+      <w:r>
+        <w:t>3  Compare Trials 2 and 3  How did damping change the applied joint motion and measured tool displacement</w:t>
+      </w:r>
+    </w:p>
+    <w:p>
+      <w:pPr>
+        <w:keepLines/>
+        <w:spacing w:after="100"/>
+      </w:pPr>
+      <w:r>
+        <w:t>________________________________________________________________________________</w:t>
+      </w:r>
+    </w:p>
+    <w:p>
+      <w:pPr>
+        <w:keepLines/>
+        <w:spacing w:after="100"/>
+      </w:pPr>
+      <w:r>
+        <w:t>________________________________________________________________________________</w:t>
+      </w:r>
+    </w:p>
+    <w:p>
+      <w:pPr>
+        <w:keepLines/>
+        <w:spacing w:after="100"/>
+      </w:pPr>
+      <w:r>
+        <w:t>________________________________________________________________________________</w:t>
+      </w:r>
+    </w:p>
+    <w:p>
+      <w:pPr>
+        <w:pStyle w:val="Heading2"/>
+      </w:pPr>
+      <w:r>
+        <w:t>4  Why was it necessary to rate limit Trial 2 instead of sending the raw undamped command directly to Webots</w:t>
+      </w:r>
+    </w:p>
+    <w:p>
+      <w:pPr>
+        <w:keepLines/>
+        <w:spacing w:after="100"/>
+      </w:pPr>
+      <w:r>
+        <w:t>________________________________________________________________________________</w:t>
+      </w:r>
+    </w:p>
+    <w:p>
+      <w:pPr>
+        <w:keepLines/>
+        <w:spacing w:after="100"/>
+      </w:pPr>
+      <w:r>
+        <w:t>________________________________________________________________________________</w:t>
+      </w:r>
+    </w:p>
+    <w:p>
+      <w:pPr>
+        <w:keepLines/>
+        <w:spacing w:after="100"/>
+      </w:pPr>
+      <w:r>
+        <w:t>________________________________________________________________________________</w:t>
+      </w:r>
+    </w:p>
+    <w:p>
+      <w:r>
         <w:rPr>
-          <w:rFonts w:ascii="Arial" w:hAnsi="Arial"/>
           <w:b/>
-          <w:i w:val="0"/>
-          <w:color w:val="000000"/>
-          <w:sz w:val="22"/>
         </w:rPr>
-        <w:t xml:space="preserve">Before submitting: </w:t>
+        <w:t xml:space="preserve">Before submitting  </w:t>
       </w:r>
       <w:r>
-        <w:rPr>
-          <w:rFonts w:ascii="Arial" w:hAnsi="Arial"/>
-          <w:b w:val="0"/>
-          <w:i w:val="0"/>
-          <w:color w:val="000000"/>
-          <w:sz w:val="22"/>
-        </w:rPr>
-        <w:t>Check that your name, requested output, figures, and explanations are included, then save the file as .docx.</w:t>
+        <w:t>Confirm that the prediction, results table, three screenshots, four answers, and your name are included. Save the personal copy as LastName_Lab04_Report.docx.</w:t>
       </w:r>
     </w:p>
     <w:sectPr>
       <w:pgSz w:w="12240" w:h="15840"/>
-      <w:pgMar w:top="1440" w:right="1440" w:bottom="1440" w:left="1440" w:header="708" w:footer="708" w:gutter="0"/>
+      <w:pgMar w:top="936" w:right="1080" w:bottom="936" w:left="1080" w:header="720" w:footer="720" w:gutter="0"/>
       <w:cols w:space="720"/>
       <w:docGrid w:linePitch="360"/>
     </w:sectPr>
@@ -1036,10 +1768,10 @@
     <w:qFormat/>
     <w:rsid w:val="00FC693F"/>
     <w:pPr>
-      <w:spacing w:before="0" w:after="160" w:line="276" w:lineRule="auto"/>
+      <w:spacing w:after="140"/>
     </w:pPr>
     <w:rPr>
-      <w:rFonts w:ascii="Arial" w:hAnsi="Arial"/>
+      <w:rFonts w:ascii="Aptos" w:hAnsi="Aptos"/>
       <w:sz w:val="22"/>
     </w:rPr>
   </w:style>
@@ -1098,11 +1830,11 @@
     <w:pPr>
       <w:keepNext/>
       <w:keepLines/>
-      <w:spacing w:before="320" w:after="100"/>
+      <w:spacing w:before="200" w:after="120"/>
       <w:outlineLvl w:val="0"/>
     </w:pPr>
     <w:rPr>
-      <w:rFonts w:asciiTheme="majorHAnsi" w:eastAsiaTheme="majorEastAsia" w:hAnsiTheme="majorHAnsi" w:cstheme="majorBidi" w:ascii="Arial" w:hAnsi="Arial"/>
+      <w:rFonts w:asciiTheme="majorHAnsi" w:eastAsiaTheme="majorEastAsia" w:hAnsiTheme="majorHAnsi" w:cstheme="majorBidi" w:ascii="Aptos Display" w:hAnsi="Aptos Display"/>
       <w:b/>
       <w:bCs/>
       <w:color w:val="000000"/>
@@ -1122,15 +1854,15 @@
     <w:pPr>
       <w:keepNext/>
       <w:keepLines/>
-      <w:spacing w:before="200" w:after="0"/>
+      <w:spacing w:before="160" w:after="80"/>
       <w:outlineLvl w:val="1"/>
     </w:pPr>
     <w:rPr>
-      <w:rFonts w:asciiTheme="majorHAnsi" w:eastAsiaTheme="majorEastAsia" w:hAnsiTheme="majorHAnsi" w:cstheme="majorBidi"/>
+      <w:rFonts w:asciiTheme="majorHAnsi" w:eastAsiaTheme="majorEastAsia" w:hAnsiTheme="majorHAnsi" w:cstheme="majorBidi" w:ascii="Aptos Display" w:hAnsi="Aptos Display"/>
       <w:b/>
       <w:bCs/>
-      <w:color w:val="4F81BD" w:themeColor="accent1"/>
-      <w:sz w:val="26"/>
+      <w:color w:val="000000"/>
+      <w:sz w:val="24"/>
       <w:szCs w:val="26"/>
     </w:rPr>
   </w:style>
@@ -1387,15 +2119,16 @@
       <w:pBdr>
         <w:bottom w:val="single" w:sz="8" w:space="4" w:color="4F81BD" w:themeColor="accent1"/>
       </w:pBdr>
-      <w:spacing w:after="300" w:line="240" w:lineRule="auto"/>
+      <w:spacing w:after="160" w:line="240" w:lineRule="auto"/>
       <w:contextualSpacing/>
     </w:pPr>
     <w:rPr>
-      <w:rFonts w:asciiTheme="majorHAnsi" w:eastAsiaTheme="majorEastAsia" w:hAnsiTheme="majorHAnsi" w:cstheme="majorBidi"/>
-      <w:color w:val="17365D" w:themeColor="text2" w:themeShade="BF"/>
+      <w:rFonts w:asciiTheme="majorHAnsi" w:eastAsiaTheme="majorEastAsia" w:hAnsiTheme="majorHAnsi" w:cstheme="majorBidi" w:ascii="Aptos Display" w:hAnsi="Aptos Display"/>
+      <w:b/>
+      <w:color w:val="000000"/>
       <w:spacing w:val="5"/>
       <w:kern w:val="28"/>
-      <w:sz w:val="52"/>
+      <w:sz w:val="48"/>
       <w:szCs w:val="52"/>
     </w:rPr>
   </w:style>

</xml_diff>

<commit_message>
Add initial implementation for Lab 4 singularities analysis
- Introduced SVG figure for revolute joint cross product visualization.
- Created empty .gitkeep file in results directory to maintain structure.
- Implemented guarded inverse-differential-motion helpers in cartesian_direction_motion.py.
- Developed guided geometric-Jacobian implementation in jacobian_starter.py.
- Added singularity metrics and scanning functionality in singularity_scan.py.
- Created a new Webots world file for Lab 4 demonstration.
</commit_message>
<xml_diff>
--- a/lab04_jacobian_singularities/Lab04_Report_Template.docx
+++ b/lab04_jacobian_singularities/Lab04_Report_Template.docx
@@ -22,7 +22,7 @@
     </w:p>
     <w:p>
       <w:r>
-        <w:t>Compare the same Cartesian request at a bent-elbow pose and near a straight-elbow singularity. The near-singular trials compare a safely rate-limited undamped inverse with a damped inverse.</w:t>
+        <w:t>Observe a stylus motion that begins at a bent-elbow pose and approaches a straight-elbow singularity. Compare the moderate joint rates in a well-conditioned baseline with the rapidly growing rates near singularity.</w:t>
       </w:r>
     </w:p>
     <w:p>
@@ -50,7 +50,7 @@
     </w:p>
     <w:p>
       <w:r>
-        <w:t>Before running Webots, predict which trial will show the most joint motion and which trial will move the tool closest to the requested 6 cm.</w:t>
+        <w:t>Before running Webots, predict where the Trial 2 joint-rate curve will rise and what will happen to the elbow at that point.</w:t>
       </w:r>
     </w:p>
     <w:p>
@@ -119,15 +119,7 @@
             <w:shd w:fill="1F4E78"/>
           </w:tcPr>
           <w:p>
-            <w:pPr>
-              <w:spacing w:after="40"/>
-            </w:pPr>
             <w:r>
-              <w:rPr>
-                <w:b/>
-                <w:color w:val="FFFFFF"/>
-                <w:sz w:val="18"/>
-              </w:rPr>
               <w:t>Quantity</w:t>
             </w:r>
           </w:p>
@@ -153,18 +145,10 @@
             <w:shd w:fill="1F4E78"/>
           </w:tcPr>
           <w:p>
-            <w:pPr>
-              <w:spacing w:after="40"/>
-            </w:pPr>
             <w:r>
-              <w:rPr>
-                <w:b/>
-                <w:color w:val="FFFFFF"/>
-                <w:sz w:val="18"/>
-              </w:rPr>
               <w:t>Trial 1</w:t>
               <w:br/>
-              <w:t>Bent undamped</w:t>
+              <w:t>Move away undamped</w:t>
             </w:r>
           </w:p>
         </w:tc>
@@ -189,54 +173,10 @@
             <w:shd w:fill="1F4E78"/>
           </w:tcPr>
           <w:p>
-            <w:pPr>
-              <w:spacing w:after="40"/>
-            </w:pPr>
             <w:r>
-              <w:rPr>
-                <w:b/>
-                <w:color w:val="FFFFFF"/>
-                <w:sz w:val="18"/>
-              </w:rPr>
               <w:t>Trial 2</w:t>
               <w:br/>
-              <w:t>Near undamped</w:t>
-            </w:r>
-          </w:p>
-        </w:tc>
-        <w:tc>
-          <w:tcPr>
-            <w:tcW w:type="dxa" w:w="2304"/>
-            <w:vAlign w:val="center"/>
-            <w:tcMar>
-              <w:top w:w="100" w:type="dxa"/>
-              <w:start w:w="100" w:type="dxa"/>
-              <w:bottom w:w="100" w:type="dxa"/>
-              <w:end w:w="100" w:type="dxa"/>
-            </w:tcMar>
-            <w:tcBorders>
-              <w:top w:val="single" w:sz="6" w:color="D9D9D9"/>
-              <w:left w:val="single" w:sz="6" w:color="D9D9D9"/>
-              <w:bottom w:val="single" w:sz="6" w:color="D9D9D9"/>
-              <w:right w:val="single" w:sz="6" w:color="D9D9D9"/>
-              <w:insideH w:val="single" w:sz="6" w:color="D9D9D9"/>
-              <w:insideV w:val="single" w:sz="6" w:color="D9D9D9"/>
-            </w:tcBorders>
-            <w:shd w:fill="1F4E78"/>
-          </w:tcPr>
-          <w:p>
-            <w:pPr>
-              <w:spacing w:after="40"/>
-            </w:pPr>
-            <w:r>
-              <w:rPr>
-                <w:b/>
-                <w:color w:val="FFFFFF"/>
-                <w:sz w:val="18"/>
-              </w:rPr>
-              <w:t>Trial 3</w:t>
-              <w:br/>
-              <w:t>Near damped</w:t>
+              <w:t>Approach singularity</w:t>
             </w:r>
           </w:p>
         </w:tc>
@@ -276,36 +216,6 @@
         <w:tc>
           <w:tcPr>
             <w:tcW w:type="dxa" w:w="2232"/>
-            <w:vAlign w:val="center"/>
-            <w:tcMar>
-              <w:top w:w="100" w:type="dxa"/>
-              <w:start w:w="100" w:type="dxa"/>
-              <w:bottom w:w="100" w:type="dxa"/>
-              <w:end w:w="100" w:type="dxa"/>
-            </w:tcMar>
-            <w:tcBorders>
-              <w:top w:val="single" w:sz="6" w:color="D9D9D9"/>
-              <w:left w:val="single" w:sz="6" w:color="D9D9D9"/>
-              <w:bottom w:val="single" w:sz="6" w:color="D9D9D9"/>
-              <w:right w:val="single" w:sz="6" w:color="D9D9D9"/>
-              <w:insideH w:val="single" w:sz="6" w:color="D9D9D9"/>
-              <w:insideV w:val="single" w:sz="6" w:color="D9D9D9"/>
-            </w:tcBorders>
-          </w:tcPr>
-          <w:p>
-            <w:pPr>
-              <w:spacing w:after="40"/>
-            </w:pPr>
-            <w:r>
-              <w:rPr>
-                <w:sz w:val="19"/>
-              </w:rPr>
-            </w:r>
-          </w:p>
-        </w:tc>
-        <w:tc>
-          <w:tcPr>
-            <w:tcW w:type="dxa" w:w="2304"/>
             <w:vAlign w:val="center"/>
             <w:tcMar>
               <w:top w:w="100" w:type="dxa"/>
@@ -459,37 +369,6 @@
             </w:r>
           </w:p>
         </w:tc>
-        <w:tc>
-          <w:tcPr>
-            <w:tcW w:type="dxa" w:w="2304"/>
-            <w:vAlign w:val="center"/>
-            <w:tcMar>
-              <w:top w:w="100" w:type="dxa"/>
-              <w:start w:w="100" w:type="dxa"/>
-              <w:bottom w:w="100" w:type="dxa"/>
-              <w:end w:w="100" w:type="dxa"/>
-            </w:tcMar>
-            <w:tcBorders>
-              <w:top w:val="single" w:sz="6" w:color="D9D9D9"/>
-              <w:left w:val="single" w:sz="6" w:color="D9D9D9"/>
-              <w:bottom w:val="single" w:sz="6" w:color="D9D9D9"/>
-              <w:right w:val="single" w:sz="6" w:color="D9D9D9"/>
-              <w:insideH w:val="single" w:sz="6" w:color="D9D9D9"/>
-              <w:insideV w:val="single" w:sz="6" w:color="D9D9D9"/>
-            </w:tcBorders>
-            <w:shd w:fill="EAF2F8"/>
-          </w:tcPr>
-          <w:p>
-            <w:pPr>
-              <w:spacing w:after="40"/>
-            </w:pPr>
-            <w:r>
-              <w:rPr>
-                <w:sz w:val="19"/>
-              </w:rPr>
-            </w:r>
-          </w:p>
-        </w:tc>
       </w:tr>
       <w:tr>
         <w:tc>
@@ -526,36 +405,6 @@
         <w:tc>
           <w:tcPr>
             <w:tcW w:type="dxa" w:w="2232"/>
-            <w:vAlign w:val="center"/>
-            <w:tcMar>
-              <w:top w:w="100" w:type="dxa"/>
-              <w:start w:w="100" w:type="dxa"/>
-              <w:bottom w:w="100" w:type="dxa"/>
-              <w:end w:w="100" w:type="dxa"/>
-            </w:tcMar>
-            <w:tcBorders>
-              <w:top w:val="single" w:sz="6" w:color="D9D9D9"/>
-              <w:left w:val="single" w:sz="6" w:color="D9D9D9"/>
-              <w:bottom w:val="single" w:sz="6" w:color="D9D9D9"/>
-              <w:right w:val="single" w:sz="6" w:color="D9D9D9"/>
-              <w:insideH w:val="single" w:sz="6" w:color="D9D9D9"/>
-              <w:insideV w:val="single" w:sz="6" w:color="D9D9D9"/>
-            </w:tcBorders>
-          </w:tcPr>
-          <w:p>
-            <w:pPr>
-              <w:spacing w:after="40"/>
-            </w:pPr>
-            <w:r>
-              <w:rPr>
-                <w:sz w:val="19"/>
-              </w:rPr>
-            </w:r>
-          </w:p>
-        </w:tc>
-        <w:tc>
-          <w:tcPr>
-            <w:tcW w:type="dxa" w:w="2304"/>
             <w:vAlign w:val="center"/>
             <w:tcMar>
               <w:top w:w="100" w:type="dxa"/>
@@ -709,37 +558,6 @@
             </w:r>
           </w:p>
         </w:tc>
-        <w:tc>
-          <w:tcPr>
-            <w:tcW w:type="dxa" w:w="2304"/>
-            <w:vAlign w:val="center"/>
-            <w:tcMar>
-              <w:top w:w="100" w:type="dxa"/>
-              <w:start w:w="100" w:type="dxa"/>
-              <w:bottom w:w="100" w:type="dxa"/>
-              <w:end w:w="100" w:type="dxa"/>
-            </w:tcMar>
-            <w:tcBorders>
-              <w:top w:val="single" w:sz="6" w:color="D9D9D9"/>
-              <w:left w:val="single" w:sz="6" w:color="D9D9D9"/>
-              <w:bottom w:val="single" w:sz="6" w:color="D9D9D9"/>
-              <w:right w:val="single" w:sz="6" w:color="D9D9D9"/>
-              <w:insideH w:val="single" w:sz="6" w:color="D9D9D9"/>
-              <w:insideV w:val="single" w:sz="6" w:color="D9D9D9"/>
-            </w:tcBorders>
-            <w:shd w:fill="EAF2F8"/>
-          </w:tcPr>
-          <w:p>
-            <w:pPr>
-              <w:spacing w:after="40"/>
-            </w:pPr>
-            <w:r>
-              <w:rPr>
-                <w:sz w:val="19"/>
-              </w:rPr>
-            </w:r>
-          </w:p>
-        </w:tc>
       </w:tr>
       <w:tr>
         <w:tc>
@@ -776,36 +594,6 @@
         <w:tc>
           <w:tcPr>
             <w:tcW w:type="dxa" w:w="2232"/>
-            <w:vAlign w:val="center"/>
-            <w:tcMar>
-              <w:top w:w="100" w:type="dxa"/>
-              <w:start w:w="100" w:type="dxa"/>
-              <w:bottom w:w="100" w:type="dxa"/>
-              <w:end w:w="100" w:type="dxa"/>
-            </w:tcMar>
-            <w:tcBorders>
-              <w:top w:val="single" w:sz="6" w:color="D9D9D9"/>
-              <w:left w:val="single" w:sz="6" w:color="D9D9D9"/>
-              <w:bottom w:val="single" w:sz="6" w:color="D9D9D9"/>
-              <w:right w:val="single" w:sz="6" w:color="D9D9D9"/>
-              <w:insideH w:val="single" w:sz="6" w:color="D9D9D9"/>
-              <w:insideV w:val="single" w:sz="6" w:color="D9D9D9"/>
-            </w:tcBorders>
-          </w:tcPr>
-          <w:p>
-            <w:pPr>
-              <w:spacing w:after="40"/>
-            </w:pPr>
-            <w:r>
-              <w:rPr>
-                <w:sz w:val="19"/>
-              </w:rPr>
-            </w:r>
-          </w:p>
-        </w:tc>
-        <w:tc>
-          <w:tcPr>
-            <w:tcW w:type="dxa" w:w="2304"/>
             <w:vAlign w:val="center"/>
             <w:tcMar>
               <w:top w:w="100" w:type="dxa"/>
@@ -959,43 +747,10 @@
             </w:r>
           </w:p>
         </w:tc>
-        <w:tc>
-          <w:tcPr>
-            <w:tcW w:type="dxa" w:w="2304"/>
-            <w:vAlign w:val="center"/>
-            <w:tcMar>
-              <w:top w:w="100" w:type="dxa"/>
-              <w:start w:w="100" w:type="dxa"/>
-              <w:bottom w:w="100" w:type="dxa"/>
-              <w:end w:w="100" w:type="dxa"/>
-            </w:tcMar>
-            <w:tcBorders>
-              <w:top w:val="single" w:sz="6" w:color="D9D9D9"/>
-              <w:left w:val="single" w:sz="6" w:color="D9D9D9"/>
-              <w:bottom w:val="single" w:sz="6" w:color="D9D9D9"/>
-              <w:right w:val="single" w:sz="6" w:color="D9D9D9"/>
-              <w:insideH w:val="single" w:sz="6" w:color="D9D9D9"/>
-              <w:insideV w:val="single" w:sz="6" w:color="D9D9D9"/>
-            </w:tcBorders>
-            <w:shd w:fill="EAF2F8"/>
-          </w:tcPr>
-          <w:p>
-            <w:pPr>
-              <w:spacing w:after="40"/>
-            </w:pPr>
-            <w:r>
-              <w:rPr>
-                <w:sz w:val="19"/>
-              </w:rPr>
-            </w:r>
-          </w:p>
-        </w:tc>
       </w:tr>
     </w:tbl>
     <w:p>
-      <w:r>
-        <w:br w:type="page"/>
-      </w:r>
+      <w:r/>
     </w:p>
     <w:p>
       <w:pPr>
@@ -1007,7 +762,7 @@
     </w:p>
     <w:p>
       <w:r>
-        <w:t>Insert one screenshot from each trial. Show the complete robot pose and include readable console output in at least one screenshot.</w:t>
+        <w:t>Insert a Trial 1 baseline screenshot and a Trial 2 screenshot at the condition-number-200 checkpoint. The Trial 2 screenshot must show the on-scene joint-rate readout. Also insert the generated joint-rate comparison plot.</w:t>
       </w:r>
     </w:p>
     <w:p>
@@ -1015,7 +770,7 @@
         <w:pStyle w:val="Heading2"/>
       </w:pPr>
       <w:r>
-        <w:t>Trial 1 Bent Elbow Undamped</w:t>
+        <w:t>Trial 1 Move Away Undamped Baseline</w:t>
       </w:r>
     </w:p>
     <w:tbl>
@@ -1063,7 +818,7 @@
         <w:pStyle w:val="Heading2"/>
       </w:pPr>
       <w:r>
-        <w:t>Trial 2 Near Singular Undamped</w:t>
+        <w:t>Trial 2 Approach Singularity Undamped</w:t>
       </w:r>
     </w:p>
     <w:tbl>
@@ -1107,128 +862,7 @@
       </w:tr>
     </w:tbl>
     <w:p>
-      <w:r>
-        <w:br w:type="page"/>
-      </w:r>
-    </w:p>
-    <w:p>
-      <w:pPr>
-        <w:pStyle w:val="Heading1"/>
-      </w:pPr>
-      <w:r>
-        <w:t>Damped Comparison</w:t>
-      </w:r>
-    </w:p>
-    <w:p>
-      <w:pPr>
-        <w:pStyle w:val="Heading2"/>
-      </w:pPr>
-      <w:r>
-        <w:t>Trial 3 Near Singular Damped</w:t>
-      </w:r>
-    </w:p>
-    <w:tbl>
-      <w:tblPr>
-        <w:tblW w:type="auto" w:w="0"/>
-        <w:tblLook w:firstColumn="1" w:firstRow="1" w:lastColumn="0" w:lastRow="0" w:noHBand="0" w:noVBand="1" w:val="04A0"/>
-      </w:tblPr>
-      <w:tblGrid>
-        <w:gridCol w:w="10080"/>
-      </w:tblGrid>
-      <w:tr>
-        <w:tc>
-          <w:tcPr>
-            <w:tcW w:type="dxa" w:w="10080"/>
-            <w:vAlign w:val="center"/>
-            <w:tcBorders>
-              <w:top w:val="single" w:sz="8" w:color="A6A6A6"/>
-              <w:left w:val="single" w:sz="8" w:color="A6A6A6"/>
-              <w:bottom w:val="single" w:sz="8" w:color="A6A6A6"/>
-              <w:right w:val="single" w:sz="8" w:color="A6A6A6"/>
-              <w:insideH w:val="single" w:sz="8" w:color="A6A6A6"/>
-              <w:insideV w:val="single" w:sz="8" w:color="A6A6A6"/>
-            </w:tcBorders>
-            <w:tcMar>
-              <w:top w:w="150" w:type="dxa"/>
-              <w:start w:w="150" w:type="dxa"/>
-              <w:bottom w:w="150" w:type="dxa"/>
-              <w:end w:w="150" w:type="dxa"/>
-            </w:tcMar>
-          </w:tcPr>
-          <w:p>
-            <w:pPr>
-              <w:spacing w:before="1360" w:after="1360"/>
-              <w:jc w:val="center"/>
-            </w:pPr>
-            <w:r>
-              <w:t>Replace this text with the Trial 3 Webots screenshot</w:t>
-            </w:r>
-          </w:p>
-        </w:tc>
-      </w:tr>
-    </w:tbl>
-    <w:p>
-      <w:pPr>
-        <w:pStyle w:val="Heading2"/>
-      </w:pPr>
-      <w:r>
-        <w:t>Trial 2 and Trial 3 Observation</w:t>
-      </w:r>
-    </w:p>
-    <w:p>
-      <w:r>
-        <w:t>Describe the visible difference in joint motion and tool displacement. Remember that both trials start from the same robot configuration.</w:t>
-      </w:r>
-    </w:p>
-    <w:p>
-      <w:pPr>
-        <w:keepLines/>
-        <w:spacing w:after="100"/>
-      </w:pPr>
-      <w:r>
-        <w:t>________________________________________________________________________________</w:t>
-      </w:r>
-    </w:p>
-    <w:p>
-      <w:pPr>
-        <w:keepLines/>
-        <w:spacing w:after="100"/>
-      </w:pPr>
-      <w:r>
-        <w:t>________________________________________________________________________________</w:t>
-      </w:r>
-    </w:p>
-    <w:p>
-      <w:pPr>
-        <w:keepLines/>
-        <w:spacing w:after="100"/>
-      </w:pPr>
-      <w:r>
-        <w:t>________________________________________________________________________________</w:t>
-      </w:r>
-    </w:p>
-    <w:p>
-      <w:pPr>
-        <w:keepLines/>
-        <w:spacing w:after="100"/>
-      </w:pPr>
-      <w:r>
-        <w:t>________________________________________________________________________________</w:t>
-      </w:r>
-    </w:p>
-    <w:p>
-      <w:pPr>
-        <w:keepLines/>
-        <w:spacing w:after="100"/>
-      </w:pPr>
-      <w:r>
-        <w:t>________________________________________________________________________________</w:t>
-      </w:r>
-    </w:p>
-    <w:p>
-      <w:r>
-        <w:br w:type="page"/>
-      </w:r>
+      <w:r/>
     </w:p>
     <w:p>
       <w:pPr>
@@ -1248,7 +882,7 @@
         <w:pStyle w:val="Heading2"/>
       </w:pPr>
       <w:r>
-        <w:t>1  Which configuration was closer to a singularity  Support your answer using the minimum singular value and condition number</w:t>
+        <w:t>1  What happened to the minimum singular value and condition number as Trial 2 approached the straight elbow</w:t>
       </w:r>
     </w:p>
     <w:p>
@@ -1283,7 +917,7 @@
         <w:pStyle w:val="Heading2"/>
       </w:pPr>
       <w:r>
-        <w:t>2  In Trial 2 why did the raw undamped inverse request large joint rates even though the requested translation was only 6 cm</w:t>
+        <w:t>2  Why did the undamped joint rate rise near the end of Trial 2 even though Cartesian speed remained constant</w:t>
       </w:r>
     </w:p>
     <w:p>
@@ -1318,42 +952,7 @@
         <w:pStyle w:val="Heading2"/>
       </w:pPr>
       <w:r>
-        <w:t>3  Compare Trials 2 and 3  How did damping change the applied joint motion and measured tool displacement</w:t>
-      </w:r>
-    </w:p>
-    <w:p>
-      <w:pPr>
-        <w:keepLines/>
-        <w:spacing w:after="100"/>
-      </w:pPr>
-      <w:r>
-        <w:t>________________________________________________________________________________</w:t>
-      </w:r>
-    </w:p>
-    <w:p>
-      <w:pPr>
-        <w:keepLines/>
-        <w:spacing w:after="100"/>
-      </w:pPr>
-      <w:r>
-        <w:t>________________________________________________________________________________</w:t>
-      </w:r>
-    </w:p>
-    <w:p>
-      <w:pPr>
-        <w:keepLines/>
-        <w:spacing w:after="100"/>
-      </w:pPr>
-      <w:r>
-        <w:t>________________________________________________________________________________</w:t>
-      </w:r>
-    </w:p>
-    <w:p>
-      <w:pPr>
-        <w:pStyle w:val="Heading2"/>
-      </w:pPr>
-      <w:r>
-        <w:t>4  Why was it necessary to rate limit Trial 2 instead of sending the raw undamped command directly to Webots</w:t>
+        <w:t>3  Why was it necessary to rate limit Trial 2 instead of sending the raw undamped command directly to Webots</w:t>
       </w:r>
     </w:p>
     <w:p>
@@ -1385,13 +984,7 @@
     </w:p>
     <w:p>
       <w:r>
-        <w:rPr>
-          <w:b/>
-        </w:rPr>
-        <w:t xml:space="preserve">Before submitting  </w:t>
-      </w:r>
-      <w:r>
-        <w:t>Confirm that the prediction, results table, three screenshots, four answers, and your name are included. Save the personal copy as LastName_Lab04_Report.docx.</w:t>
+        <w:t>Before submitting  Confirm that the prediction, results table, two screenshots, joint-rate comparison plot, three answers, and your name are included. Save the personal copy as LastName_Lab04_Report.docx.</w:t>
       </w:r>
     </w:p>
     <w:sectPr>

</xml_diff>